<commit_message>
completed and submitted proposal
</commit_message>
<xml_diff>
--- a/docs/22f1001864_proposal.docx
+++ b/docs/22f1001864_proposal.docx
@@ -824,6 +824,15 @@
               </w:rPr>
               <w:t>Expected Outcome</w:t>
             </w:r>
+            <w:r>
+              <w:rPr>
+                <w:rFonts w:ascii="Times New Roman" w:hAnsi="Times New Roman" w:cs="Times New Roman"/>
+                <w:sz w:val="28"/>
+                <w:szCs w:val="28"/>
+                <w:lang w:val="en-US"/>
+              </w:rPr>
+              <w:t>s</w:t>
+            </w:r>
           </w:p>
         </w:tc>
         <w:tc>
@@ -963,7 +972,16 @@
           <w:szCs w:val="24"/>
           <w:lang w:val="en-US"/>
         </w:rPr>
-        <w:t xml:space="preserve">ANALISIS AND </w:t>
+        <w:t>ANALY</w:t>
+      </w:r>
+      <w:r>
+        <w:rPr>
+          <w:rFonts w:ascii="Times New Roman" w:hAnsi="Times New Roman" w:cs="Times New Roman"/>
+          <w:sz w:val="24"/>
+          <w:szCs w:val="24"/>
+          <w:lang w:val="en-US"/>
+        </w:rPr>
+        <w:t xml:space="preserve">SIS AND </w:t>
       </w:r>
       <w:r>
         <w:rPr>
@@ -1204,15 +1222,6 @@
           <w:lang w:val="en-US"/>
         </w:rPr>
       </w:pPr>
-      <w:r>
-        <w:rPr>
-          <w:rFonts w:ascii="Times New Roman" w:hAnsi="Times New Roman" w:cs="Times New Roman"/>
-          <w:sz w:val="24"/>
-          <w:szCs w:val="24"/>
-          <w:lang w:val="en-US"/>
-        </w:rPr>
-        <w:t xml:space="preserve">Date: </w:t>
-      </w:r>
     </w:p>
     <w:p>
       <w:pPr>
@@ -2777,7 +2786,25 @@
           <w:szCs w:val="24"/>
           <w:lang w:val="en-US"/>
         </w:rPr>
-        <w:t xml:space="preserve"> credit history in the form previous transactional data or some of them being previous customers of the company. Utilizing this complex data into determining the repayment capability of the customer is also a major challenge for the company.  </w:t>
+        <w:t xml:space="preserve"> credit history in the form</w:t>
+      </w:r>
+      <w:r>
+        <w:rPr>
+          <w:rFonts w:ascii="Times New Roman" w:hAnsi="Times New Roman" w:cs="Times New Roman"/>
+          <w:sz w:val="24"/>
+          <w:szCs w:val="24"/>
+          <w:lang w:val="en-US"/>
+        </w:rPr>
+        <w:t xml:space="preserve"> of</w:t>
+      </w:r>
+      <w:r>
+        <w:rPr>
+          <w:rFonts w:ascii="Times New Roman" w:hAnsi="Times New Roman" w:cs="Times New Roman"/>
+          <w:sz w:val="24"/>
+          <w:szCs w:val="24"/>
+          <w:lang w:val="en-US"/>
+        </w:rPr>
+        <w:t xml:space="preserve"> previous transactional data or some of them being previous customers of the company. Utilizing this complex data into determining the repayment capability of the customer is also a major challenge for the company.  </w:t>
       </w:r>
     </w:p>
     <w:p>
@@ -3677,19 +3704,8 @@
           <w:lang w:val="en-US"/>
         </w:rPr>
         <w:lastRenderedPageBreak/>
-        <w:t xml:space="preserve">Gantt </w:t>
-      </w:r>
-      <w:proofErr w:type="gramStart"/>
-      <w:r>
-        <w:rPr>
-          <w:rFonts w:ascii="Times New Roman" w:hAnsi="Times New Roman" w:cs="Times New Roman"/>
-          <w:sz w:val="34"/>
-          <w:szCs w:val="34"/>
-          <w:lang w:val="en-US"/>
-        </w:rPr>
-        <w:t>Chart</w:t>
-      </w:r>
-      <w:proofErr w:type="gramEnd"/>
+        <w:t>Gantt Chart</w:t>
+      </w:r>
     </w:p>
     <w:tbl>
       <w:tblPr>
@@ -3701,15 +3717,14 @@
       </w:tblPr>
       <w:tblGrid>
         <w:gridCol w:w="1887"/>
-        <w:gridCol w:w="2764"/>
-        <w:gridCol w:w="672"/>
-        <w:gridCol w:w="608"/>
-        <w:gridCol w:w="709"/>
-        <w:gridCol w:w="8"/>
-        <w:gridCol w:w="700"/>
-        <w:gridCol w:w="811"/>
-        <w:gridCol w:w="890"/>
-        <w:gridCol w:w="713"/>
+        <w:gridCol w:w="3910"/>
+        <w:gridCol w:w="567"/>
+        <w:gridCol w:w="567"/>
+        <w:gridCol w:w="567"/>
+        <w:gridCol w:w="567"/>
+        <w:gridCol w:w="567"/>
+        <w:gridCol w:w="567"/>
+        <w:gridCol w:w="563"/>
         <w:gridCol w:w="571"/>
       </w:tblGrid>
       <w:tr>
@@ -3739,7 +3754,7 @@
         </w:tc>
         <w:tc>
           <w:tcPr>
-            <w:tcW w:w="2764" w:type="dxa"/>
+            <w:tcW w:w="3910" w:type="dxa"/>
             <w:tcBorders>
               <w:top w:val="nil"/>
               <w:left w:val="nil"/>
@@ -3761,8 +3776,8 @@
         </w:tc>
         <w:tc>
           <w:tcPr>
-            <w:tcW w:w="2697" w:type="dxa"/>
-            <w:gridSpan w:val="5"/>
+            <w:tcW w:w="2268" w:type="dxa"/>
+            <w:gridSpan w:val="4"/>
             <w:tcBorders>
               <w:top w:val="single" w:sz="12" w:space="0" w:color="auto"/>
               <w:left w:val="single" w:sz="12" w:space="0" w:color="auto"/>
@@ -3792,7 +3807,7 @@
         </w:tc>
         <w:tc>
           <w:tcPr>
-            <w:tcW w:w="2985" w:type="dxa"/>
+            <w:tcW w:w="2268" w:type="dxa"/>
             <w:gridSpan w:val="4"/>
             <w:tcBorders>
               <w:top w:val="single" w:sz="12" w:space="0" w:color="auto"/>
@@ -3828,7 +3843,7 @@
         </w:trPr>
         <w:tc>
           <w:tcPr>
-            <w:tcW w:w="4651" w:type="dxa"/>
+            <w:tcW w:w="5797" w:type="dxa"/>
             <w:gridSpan w:val="2"/>
             <w:tcBorders>
               <w:top w:val="single" w:sz="12" w:space="0" w:color="auto"/>
@@ -3860,7 +3875,7 @@
         </w:tc>
         <w:tc>
           <w:tcPr>
-            <w:tcW w:w="672" w:type="dxa"/>
+            <w:tcW w:w="567" w:type="dxa"/>
             <w:tcBorders>
               <w:left w:val="single" w:sz="12" w:space="0" w:color="auto"/>
               <w:bottom w:val="single" w:sz="12" w:space="0" w:color="auto"/>
@@ -3889,7 +3904,7 @@
         </w:tc>
         <w:tc>
           <w:tcPr>
-            <w:tcW w:w="608" w:type="dxa"/>
+            <w:tcW w:w="567" w:type="dxa"/>
             <w:tcBorders>
               <w:bottom w:val="single" w:sz="12" w:space="0" w:color="auto"/>
             </w:tcBorders>
@@ -3917,7 +3932,7 @@
         </w:tc>
         <w:tc>
           <w:tcPr>
-            <w:tcW w:w="709" w:type="dxa"/>
+            <w:tcW w:w="567" w:type="dxa"/>
             <w:tcBorders>
               <w:bottom w:val="single" w:sz="12" w:space="0" w:color="auto"/>
             </w:tcBorders>
@@ -3945,8 +3960,7 @@
         </w:tc>
         <w:tc>
           <w:tcPr>
-            <w:tcW w:w="708" w:type="dxa"/>
-            <w:gridSpan w:val="2"/>
+            <w:tcW w:w="567" w:type="dxa"/>
             <w:tcBorders>
               <w:bottom w:val="single" w:sz="12" w:space="0" w:color="auto"/>
               <w:right w:val="single" w:sz="12" w:space="0" w:color="auto"/>
@@ -3975,7 +3989,7 @@
         </w:tc>
         <w:tc>
           <w:tcPr>
-            <w:tcW w:w="811" w:type="dxa"/>
+            <w:tcW w:w="567" w:type="dxa"/>
             <w:tcBorders>
               <w:left w:val="single" w:sz="12" w:space="0" w:color="auto"/>
               <w:bottom w:val="single" w:sz="12" w:space="0" w:color="auto"/>
@@ -4004,7 +4018,7 @@
         </w:tc>
         <w:tc>
           <w:tcPr>
-            <w:tcW w:w="890" w:type="dxa"/>
+            <w:tcW w:w="567" w:type="dxa"/>
             <w:tcBorders>
               <w:bottom w:val="single" w:sz="12" w:space="0" w:color="auto"/>
             </w:tcBorders>
@@ -4032,7 +4046,7 @@
         </w:tc>
         <w:tc>
           <w:tcPr>
-            <w:tcW w:w="713" w:type="dxa"/>
+            <w:tcW w:w="563" w:type="dxa"/>
             <w:tcBorders>
               <w:bottom w:val="single" w:sz="12" w:space="0" w:color="auto"/>
             </w:tcBorders>
@@ -4085,6 +4099,252 @@
               </w:rPr>
               <w:t>W4</w:t>
             </w:r>
+          </w:p>
+        </w:tc>
+      </w:tr>
+      <w:tr>
+        <w:trPr>
+          <w:trHeight w:val="361"/>
+        </w:trPr>
+        <w:tc>
+          <w:tcPr>
+            <w:tcW w:w="1887" w:type="dxa"/>
+            <w:vMerge w:val="restart"/>
+            <w:tcBorders>
+              <w:top w:val="single" w:sz="12" w:space="0" w:color="auto"/>
+              <w:left w:val="single" w:sz="12" w:space="0" w:color="auto"/>
+              <w:right w:val="single" w:sz="4" w:space="0" w:color="auto"/>
+            </w:tcBorders>
+            <w:shd w:val="clear" w:color="auto" w:fill="A8D08D" w:themeFill="accent6" w:themeFillTint="99"/>
+          </w:tcPr>
+          <w:p>
+            <w:pPr>
+              <w:rPr>
+                <w:rFonts w:ascii="Times New Roman" w:hAnsi="Times New Roman" w:cs="Times New Roman"/>
+                <w:sz w:val="24"/>
+                <w:szCs w:val="24"/>
+                <w:lang w:val="en-US"/>
+              </w:rPr>
+            </w:pPr>
+          </w:p>
+          <w:p>
+            <w:pPr>
+              <w:rPr>
+                <w:rFonts w:ascii="Times New Roman" w:hAnsi="Times New Roman" w:cs="Times New Roman"/>
+                <w:sz w:val="24"/>
+                <w:szCs w:val="24"/>
+                <w:lang w:val="en-US"/>
+              </w:rPr>
+            </w:pPr>
+            <w:r>
+              <w:rPr>
+                <w:rFonts w:ascii="Times New Roman" w:hAnsi="Times New Roman" w:cs="Times New Roman"/>
+                <w:sz w:val="24"/>
+                <w:szCs w:val="24"/>
+                <w:lang w:val="en-US"/>
+              </w:rPr>
+              <w:t>Exploratory Data Analysis</w:t>
+            </w:r>
+          </w:p>
+        </w:tc>
+        <w:tc>
+          <w:tcPr>
+            <w:tcW w:w="3910" w:type="dxa"/>
+            <w:tcBorders>
+              <w:top w:val="single" w:sz="12" w:space="0" w:color="auto"/>
+              <w:left w:val="single" w:sz="4" w:space="0" w:color="auto"/>
+              <w:right w:val="single" w:sz="12" w:space="0" w:color="auto"/>
+            </w:tcBorders>
+            <w:shd w:val="clear" w:color="auto" w:fill="E2EFD9" w:themeFill="accent6" w:themeFillTint="33"/>
+          </w:tcPr>
+          <w:p>
+            <w:pPr>
+              <w:rPr>
+                <w:rFonts w:ascii="Times New Roman" w:hAnsi="Times New Roman" w:cs="Times New Roman"/>
+                <w:sz w:val="24"/>
+                <w:szCs w:val="24"/>
+                <w:lang w:val="en-US"/>
+              </w:rPr>
+            </w:pPr>
+            <w:r>
+              <w:rPr>
+                <w:rFonts w:ascii="Times New Roman" w:hAnsi="Times New Roman" w:cs="Times New Roman"/>
+                <w:sz w:val="24"/>
+                <w:szCs w:val="24"/>
+                <w:lang w:val="en-US"/>
+              </w:rPr>
+              <w:t>Visualize attribute distributions</w:t>
+            </w:r>
+          </w:p>
+        </w:tc>
+        <w:tc>
+          <w:tcPr>
+            <w:tcW w:w="567" w:type="dxa"/>
+            <w:tcBorders>
+              <w:top w:val="single" w:sz="12" w:space="0" w:color="auto"/>
+              <w:left w:val="single" w:sz="12" w:space="0" w:color="auto"/>
+              <w:bottom w:val="nil"/>
+              <w:right w:val="single" w:sz="4" w:space="0" w:color="auto"/>
+            </w:tcBorders>
+            <w:shd w:val="clear" w:color="auto" w:fill="5B9BD5" w:themeFill="accent1"/>
+          </w:tcPr>
+          <w:p>
+            <w:pPr>
+              <w:rPr>
+                <w:rFonts w:ascii="Times New Roman" w:hAnsi="Times New Roman" w:cs="Times New Roman"/>
+                <w:sz w:val="24"/>
+                <w:szCs w:val="24"/>
+                <w:lang w:val="en-US"/>
+              </w:rPr>
+            </w:pPr>
+          </w:p>
+        </w:tc>
+        <w:tc>
+          <w:tcPr>
+            <w:tcW w:w="567" w:type="dxa"/>
+            <w:tcBorders>
+              <w:top w:val="single" w:sz="12" w:space="0" w:color="auto"/>
+              <w:left w:val="single" w:sz="4" w:space="0" w:color="auto"/>
+              <w:bottom w:val="nil"/>
+              <w:right w:val="single" w:sz="4" w:space="0" w:color="auto"/>
+            </w:tcBorders>
+            <w:shd w:val="clear" w:color="auto" w:fill="5B9BD5" w:themeFill="accent1"/>
+          </w:tcPr>
+          <w:p>
+            <w:pPr>
+              <w:rPr>
+                <w:rFonts w:ascii="Times New Roman" w:hAnsi="Times New Roman" w:cs="Times New Roman"/>
+                <w:sz w:val="24"/>
+                <w:szCs w:val="24"/>
+                <w:lang w:val="en-US"/>
+              </w:rPr>
+            </w:pPr>
+          </w:p>
+        </w:tc>
+        <w:tc>
+          <w:tcPr>
+            <w:tcW w:w="567" w:type="dxa"/>
+            <w:tcBorders>
+              <w:top w:val="single" w:sz="12" w:space="0" w:color="auto"/>
+              <w:left w:val="single" w:sz="4" w:space="0" w:color="auto"/>
+              <w:bottom w:val="nil"/>
+              <w:right w:val="single" w:sz="4" w:space="0" w:color="auto"/>
+            </w:tcBorders>
+          </w:tcPr>
+          <w:p>
+            <w:pPr>
+              <w:rPr>
+                <w:rFonts w:ascii="Times New Roman" w:hAnsi="Times New Roman" w:cs="Times New Roman"/>
+                <w:sz w:val="24"/>
+                <w:szCs w:val="24"/>
+                <w:lang w:val="en-US"/>
+              </w:rPr>
+            </w:pPr>
+          </w:p>
+        </w:tc>
+        <w:tc>
+          <w:tcPr>
+            <w:tcW w:w="567" w:type="dxa"/>
+            <w:tcBorders>
+              <w:top w:val="single" w:sz="12" w:space="0" w:color="auto"/>
+              <w:left w:val="single" w:sz="4" w:space="0" w:color="auto"/>
+              <w:bottom w:val="nil"/>
+              <w:right w:val="single" w:sz="12" w:space="0" w:color="auto"/>
+            </w:tcBorders>
+          </w:tcPr>
+          <w:p>
+            <w:pPr>
+              <w:rPr>
+                <w:rFonts w:ascii="Times New Roman" w:hAnsi="Times New Roman" w:cs="Times New Roman"/>
+                <w:sz w:val="24"/>
+                <w:szCs w:val="24"/>
+                <w:lang w:val="en-US"/>
+              </w:rPr>
+            </w:pPr>
+          </w:p>
+        </w:tc>
+        <w:tc>
+          <w:tcPr>
+            <w:tcW w:w="567" w:type="dxa"/>
+            <w:tcBorders>
+              <w:top w:val="single" w:sz="12" w:space="0" w:color="auto"/>
+              <w:left w:val="single" w:sz="12" w:space="0" w:color="auto"/>
+              <w:bottom w:val="nil"/>
+              <w:right w:val="single" w:sz="4" w:space="0" w:color="auto"/>
+            </w:tcBorders>
+          </w:tcPr>
+          <w:p>
+            <w:pPr>
+              <w:rPr>
+                <w:rFonts w:ascii="Times New Roman" w:hAnsi="Times New Roman" w:cs="Times New Roman"/>
+                <w:sz w:val="24"/>
+                <w:szCs w:val="24"/>
+                <w:lang w:val="en-US"/>
+              </w:rPr>
+            </w:pPr>
+          </w:p>
+        </w:tc>
+        <w:tc>
+          <w:tcPr>
+            <w:tcW w:w="567" w:type="dxa"/>
+            <w:tcBorders>
+              <w:top w:val="single" w:sz="12" w:space="0" w:color="auto"/>
+              <w:left w:val="single" w:sz="4" w:space="0" w:color="auto"/>
+              <w:bottom w:val="nil"/>
+              <w:right w:val="single" w:sz="4" w:space="0" w:color="auto"/>
+            </w:tcBorders>
+          </w:tcPr>
+          <w:p>
+            <w:pPr>
+              <w:rPr>
+                <w:rFonts w:ascii="Times New Roman" w:hAnsi="Times New Roman" w:cs="Times New Roman"/>
+                <w:sz w:val="24"/>
+                <w:szCs w:val="24"/>
+                <w:lang w:val="en-US"/>
+              </w:rPr>
+            </w:pPr>
+          </w:p>
+        </w:tc>
+        <w:tc>
+          <w:tcPr>
+            <w:tcW w:w="563" w:type="dxa"/>
+            <w:tcBorders>
+              <w:top w:val="single" w:sz="12" w:space="0" w:color="auto"/>
+              <w:left w:val="single" w:sz="4" w:space="0" w:color="auto"/>
+              <w:bottom w:val="nil"/>
+              <w:right w:val="single" w:sz="4" w:space="0" w:color="auto"/>
+            </w:tcBorders>
+          </w:tcPr>
+          <w:p>
+            <w:pPr>
+              <w:rPr>
+                <w:rFonts w:ascii="Times New Roman" w:hAnsi="Times New Roman" w:cs="Times New Roman"/>
+                <w:sz w:val="24"/>
+                <w:szCs w:val="24"/>
+                <w:lang w:val="en-US"/>
+              </w:rPr>
+            </w:pPr>
+          </w:p>
+        </w:tc>
+        <w:tc>
+          <w:tcPr>
+            <w:tcW w:w="571" w:type="dxa"/>
+            <w:tcBorders>
+              <w:top w:val="single" w:sz="12" w:space="0" w:color="auto"/>
+              <w:left w:val="single" w:sz="4" w:space="0" w:color="auto"/>
+              <w:bottom w:val="nil"/>
+              <w:right w:val="single" w:sz="12" w:space="0" w:color="auto"/>
+            </w:tcBorders>
+          </w:tcPr>
+          <w:p>
+            <w:pPr>
+              <w:rPr>
+                <w:rFonts w:ascii="Times New Roman" w:hAnsi="Times New Roman" w:cs="Times New Roman"/>
+                <w:sz w:val="24"/>
+                <w:szCs w:val="24"/>
+                <w:lang w:val="en-US"/>
+              </w:rPr>
+            </w:pPr>
           </w:p>
         </w:tc>
       </w:tr>
@@ -4095,9 +4355,8 @@
         <w:tc>
           <w:tcPr>
             <w:tcW w:w="1887" w:type="dxa"/>
-            <w:vMerge w:val="restart"/>
-            <w:tcBorders>
-              <w:top w:val="single" w:sz="12" w:space="0" w:color="auto"/>
+            <w:vMerge/>
+            <w:tcBorders>
               <w:left w:val="single" w:sz="12" w:space="0" w:color="auto"/>
               <w:right w:val="single" w:sz="4" w:space="0" w:color="auto"/>
             </w:tcBorders>
@@ -4112,22 +4371,12 @@
                 <w:lang w:val="en-US"/>
               </w:rPr>
             </w:pPr>
-            <w:r>
-              <w:rPr>
-                <w:rFonts w:ascii="Times New Roman" w:hAnsi="Times New Roman" w:cs="Times New Roman"/>
-                <w:sz w:val="24"/>
-                <w:szCs w:val="24"/>
-                <w:lang w:val="en-US"/>
-              </w:rPr>
-              <w:t>Exploratory Data Analysis</w:t>
-            </w:r>
-          </w:p>
-        </w:tc>
-        <w:tc>
-          <w:tcPr>
-            <w:tcW w:w="2764" w:type="dxa"/>
-            <w:tcBorders>
-              <w:top w:val="single" w:sz="12" w:space="0" w:color="auto"/>
+          </w:p>
+        </w:tc>
+        <w:tc>
+          <w:tcPr>
+            <w:tcW w:w="3910" w:type="dxa"/>
+            <w:tcBorders>
               <w:left w:val="single" w:sz="4" w:space="0" w:color="auto"/>
               <w:right w:val="single" w:sz="12" w:space="0" w:color="auto"/>
             </w:tcBorders>
@@ -4149,15 +4398,15 @@
                 <w:szCs w:val="24"/>
                 <w:lang w:val="en-US"/>
               </w:rPr>
-              <w:t>Visualize attribute distributions</w:t>
+              <w:t>Spot and mark outlier records</w:t>
             </w:r>
           </w:p>
         </w:tc>
         <w:tc>
           <w:tcPr>
-            <w:tcW w:w="672" w:type="dxa"/>
-            <w:tcBorders>
-              <w:top w:val="single" w:sz="12" w:space="0" w:color="auto"/>
+            <w:tcW w:w="567" w:type="dxa"/>
+            <w:tcBorders>
+              <w:top w:val="nil"/>
               <w:left w:val="single" w:sz="12" w:space="0" w:color="auto"/>
               <w:bottom w:val="nil"/>
               <w:right w:val="single" w:sz="4" w:space="0" w:color="auto"/>
@@ -4177,9 +4426,9 @@
         </w:tc>
         <w:tc>
           <w:tcPr>
-            <w:tcW w:w="608" w:type="dxa"/>
-            <w:tcBorders>
-              <w:top w:val="single" w:sz="12" w:space="0" w:color="auto"/>
+            <w:tcW w:w="567" w:type="dxa"/>
+            <w:tcBorders>
+              <w:top w:val="nil"/>
               <w:left w:val="single" w:sz="4" w:space="0" w:color="auto"/>
               <w:bottom w:val="nil"/>
               <w:right w:val="single" w:sz="4" w:space="0" w:color="auto"/>
@@ -4199,10 +4448,9 @@
         </w:tc>
         <w:tc>
           <w:tcPr>
-            <w:tcW w:w="717" w:type="dxa"/>
-            <w:gridSpan w:val="2"/>
-            <w:tcBorders>
-              <w:top w:val="single" w:sz="12" w:space="0" w:color="auto"/>
+            <w:tcW w:w="567" w:type="dxa"/>
+            <w:tcBorders>
+              <w:top w:val="nil"/>
               <w:left w:val="single" w:sz="4" w:space="0" w:color="auto"/>
               <w:bottom w:val="nil"/>
               <w:right w:val="single" w:sz="4" w:space="0" w:color="auto"/>
@@ -4221,9 +4469,9 @@
         </w:tc>
         <w:tc>
           <w:tcPr>
-            <w:tcW w:w="700" w:type="dxa"/>
-            <w:tcBorders>
-              <w:top w:val="single" w:sz="12" w:space="0" w:color="auto"/>
+            <w:tcW w:w="567" w:type="dxa"/>
+            <w:tcBorders>
+              <w:top w:val="nil"/>
               <w:left w:val="single" w:sz="4" w:space="0" w:color="auto"/>
               <w:bottom w:val="nil"/>
               <w:right w:val="single" w:sz="12" w:space="0" w:color="auto"/>
@@ -4242,9 +4490,9 @@
         </w:tc>
         <w:tc>
           <w:tcPr>
-            <w:tcW w:w="811" w:type="dxa"/>
-            <w:tcBorders>
-              <w:top w:val="single" w:sz="12" w:space="0" w:color="auto"/>
+            <w:tcW w:w="567" w:type="dxa"/>
+            <w:tcBorders>
+              <w:top w:val="nil"/>
               <w:left w:val="single" w:sz="12" w:space="0" w:color="auto"/>
               <w:bottom w:val="nil"/>
               <w:right w:val="single" w:sz="4" w:space="0" w:color="auto"/>
@@ -4263,9 +4511,9 @@
         </w:tc>
         <w:tc>
           <w:tcPr>
-            <w:tcW w:w="890" w:type="dxa"/>
-            <w:tcBorders>
-              <w:top w:val="single" w:sz="12" w:space="0" w:color="auto"/>
+            <w:tcW w:w="567" w:type="dxa"/>
+            <w:tcBorders>
+              <w:top w:val="nil"/>
               <w:left w:val="single" w:sz="4" w:space="0" w:color="auto"/>
               <w:bottom w:val="nil"/>
               <w:right w:val="single" w:sz="4" w:space="0" w:color="auto"/>
@@ -4284,9 +4532,9 @@
         </w:tc>
         <w:tc>
           <w:tcPr>
-            <w:tcW w:w="713" w:type="dxa"/>
-            <w:tcBorders>
-              <w:top w:val="single" w:sz="12" w:space="0" w:color="auto"/>
+            <w:tcW w:w="563" w:type="dxa"/>
+            <w:tcBorders>
+              <w:top w:val="nil"/>
               <w:left w:val="single" w:sz="4" w:space="0" w:color="auto"/>
               <w:bottom w:val="nil"/>
               <w:right w:val="single" w:sz="4" w:space="0" w:color="auto"/>
@@ -4307,7 +4555,234 @@
           <w:tcPr>
             <w:tcW w:w="571" w:type="dxa"/>
             <w:tcBorders>
-              <w:top w:val="single" w:sz="12" w:space="0" w:color="auto"/>
+              <w:top w:val="nil"/>
+              <w:left w:val="single" w:sz="4" w:space="0" w:color="auto"/>
+              <w:bottom w:val="nil"/>
+              <w:right w:val="single" w:sz="12" w:space="0" w:color="auto"/>
+            </w:tcBorders>
+          </w:tcPr>
+          <w:p>
+            <w:pPr>
+              <w:rPr>
+                <w:rFonts w:ascii="Times New Roman" w:hAnsi="Times New Roman" w:cs="Times New Roman"/>
+                <w:sz w:val="24"/>
+                <w:szCs w:val="24"/>
+                <w:lang w:val="en-US"/>
+              </w:rPr>
+            </w:pPr>
+          </w:p>
+        </w:tc>
+      </w:tr>
+      <w:tr>
+        <w:trPr>
+          <w:trHeight w:val="340"/>
+        </w:trPr>
+        <w:tc>
+          <w:tcPr>
+            <w:tcW w:w="1887" w:type="dxa"/>
+            <w:vMerge/>
+            <w:tcBorders>
+              <w:left w:val="single" w:sz="12" w:space="0" w:color="auto"/>
+              <w:bottom w:val="single" w:sz="12" w:space="0" w:color="auto"/>
+              <w:right w:val="single" w:sz="4" w:space="0" w:color="auto"/>
+            </w:tcBorders>
+            <w:shd w:val="clear" w:color="auto" w:fill="A8D08D" w:themeFill="accent6" w:themeFillTint="99"/>
+          </w:tcPr>
+          <w:p>
+            <w:pPr>
+              <w:rPr>
+                <w:rFonts w:ascii="Times New Roman" w:hAnsi="Times New Roman" w:cs="Times New Roman"/>
+                <w:sz w:val="24"/>
+                <w:szCs w:val="24"/>
+                <w:lang w:val="en-US"/>
+              </w:rPr>
+            </w:pPr>
+          </w:p>
+        </w:tc>
+        <w:tc>
+          <w:tcPr>
+            <w:tcW w:w="3910" w:type="dxa"/>
+            <w:tcBorders>
+              <w:left w:val="single" w:sz="4" w:space="0" w:color="auto"/>
+              <w:bottom w:val="single" w:sz="12" w:space="0" w:color="auto"/>
+              <w:right w:val="single" w:sz="12" w:space="0" w:color="auto"/>
+            </w:tcBorders>
+            <w:shd w:val="clear" w:color="auto" w:fill="E2EFD9" w:themeFill="accent6" w:themeFillTint="33"/>
+          </w:tcPr>
+          <w:p>
+            <w:pPr>
+              <w:rPr>
+                <w:rFonts w:ascii="Times New Roman" w:hAnsi="Times New Roman" w:cs="Times New Roman"/>
+                <w:sz w:val="24"/>
+                <w:szCs w:val="24"/>
+                <w:lang w:val="en-US"/>
+              </w:rPr>
+            </w:pPr>
+            <w:r>
+              <w:rPr>
+                <w:rFonts w:ascii="Times New Roman" w:hAnsi="Times New Roman" w:cs="Times New Roman"/>
+                <w:sz w:val="24"/>
+                <w:szCs w:val="24"/>
+                <w:lang w:val="en-US"/>
+              </w:rPr>
+              <w:t>Filter out redundant attributes</w:t>
+            </w:r>
+          </w:p>
+        </w:tc>
+        <w:tc>
+          <w:tcPr>
+            <w:tcW w:w="567" w:type="dxa"/>
+            <w:tcBorders>
+              <w:top w:val="nil"/>
+              <w:left w:val="single" w:sz="12" w:space="0" w:color="auto"/>
+              <w:bottom w:val="nil"/>
+              <w:right w:val="single" w:sz="4" w:space="0" w:color="auto"/>
+            </w:tcBorders>
+            <w:shd w:val="clear" w:color="auto" w:fill="5B9BD5" w:themeFill="accent1"/>
+          </w:tcPr>
+          <w:p>
+            <w:pPr>
+              <w:rPr>
+                <w:rFonts w:ascii="Times New Roman" w:hAnsi="Times New Roman" w:cs="Times New Roman"/>
+                <w:sz w:val="24"/>
+                <w:szCs w:val="24"/>
+                <w:lang w:val="en-US"/>
+              </w:rPr>
+            </w:pPr>
+          </w:p>
+        </w:tc>
+        <w:tc>
+          <w:tcPr>
+            <w:tcW w:w="567" w:type="dxa"/>
+            <w:tcBorders>
+              <w:top w:val="nil"/>
+              <w:left w:val="single" w:sz="4" w:space="0" w:color="auto"/>
+              <w:bottom w:val="nil"/>
+              <w:right w:val="single" w:sz="4" w:space="0" w:color="auto"/>
+            </w:tcBorders>
+            <w:shd w:val="clear" w:color="auto" w:fill="5B9BD5" w:themeFill="accent1"/>
+          </w:tcPr>
+          <w:p>
+            <w:pPr>
+              <w:rPr>
+                <w:rFonts w:ascii="Times New Roman" w:hAnsi="Times New Roman" w:cs="Times New Roman"/>
+                <w:sz w:val="24"/>
+                <w:szCs w:val="24"/>
+                <w:lang w:val="en-US"/>
+              </w:rPr>
+            </w:pPr>
+          </w:p>
+        </w:tc>
+        <w:tc>
+          <w:tcPr>
+            <w:tcW w:w="567" w:type="dxa"/>
+            <w:tcBorders>
+              <w:top w:val="nil"/>
+              <w:left w:val="single" w:sz="4" w:space="0" w:color="auto"/>
+              <w:bottom w:val="nil"/>
+              <w:right w:val="single" w:sz="4" w:space="0" w:color="auto"/>
+            </w:tcBorders>
+          </w:tcPr>
+          <w:p>
+            <w:pPr>
+              <w:rPr>
+                <w:rFonts w:ascii="Times New Roman" w:hAnsi="Times New Roman" w:cs="Times New Roman"/>
+                <w:sz w:val="24"/>
+                <w:szCs w:val="24"/>
+                <w:lang w:val="en-US"/>
+              </w:rPr>
+            </w:pPr>
+          </w:p>
+        </w:tc>
+        <w:tc>
+          <w:tcPr>
+            <w:tcW w:w="567" w:type="dxa"/>
+            <w:tcBorders>
+              <w:top w:val="nil"/>
+              <w:left w:val="single" w:sz="4" w:space="0" w:color="auto"/>
+              <w:bottom w:val="nil"/>
+              <w:right w:val="single" w:sz="12" w:space="0" w:color="auto"/>
+            </w:tcBorders>
+          </w:tcPr>
+          <w:p>
+            <w:pPr>
+              <w:rPr>
+                <w:rFonts w:ascii="Times New Roman" w:hAnsi="Times New Roman" w:cs="Times New Roman"/>
+                <w:sz w:val="24"/>
+                <w:szCs w:val="24"/>
+                <w:lang w:val="en-US"/>
+              </w:rPr>
+            </w:pPr>
+          </w:p>
+        </w:tc>
+        <w:tc>
+          <w:tcPr>
+            <w:tcW w:w="567" w:type="dxa"/>
+            <w:tcBorders>
+              <w:top w:val="nil"/>
+              <w:left w:val="single" w:sz="12" w:space="0" w:color="auto"/>
+              <w:bottom w:val="nil"/>
+              <w:right w:val="single" w:sz="4" w:space="0" w:color="auto"/>
+            </w:tcBorders>
+          </w:tcPr>
+          <w:p>
+            <w:pPr>
+              <w:rPr>
+                <w:rFonts w:ascii="Times New Roman" w:hAnsi="Times New Roman" w:cs="Times New Roman"/>
+                <w:sz w:val="24"/>
+                <w:szCs w:val="24"/>
+                <w:lang w:val="en-US"/>
+              </w:rPr>
+            </w:pPr>
+          </w:p>
+        </w:tc>
+        <w:tc>
+          <w:tcPr>
+            <w:tcW w:w="567" w:type="dxa"/>
+            <w:tcBorders>
+              <w:top w:val="nil"/>
+              <w:left w:val="single" w:sz="4" w:space="0" w:color="auto"/>
+              <w:bottom w:val="nil"/>
+              <w:right w:val="single" w:sz="4" w:space="0" w:color="auto"/>
+            </w:tcBorders>
+          </w:tcPr>
+          <w:p>
+            <w:pPr>
+              <w:rPr>
+                <w:rFonts w:ascii="Times New Roman" w:hAnsi="Times New Roman" w:cs="Times New Roman"/>
+                <w:sz w:val="24"/>
+                <w:szCs w:val="24"/>
+                <w:lang w:val="en-US"/>
+              </w:rPr>
+            </w:pPr>
+          </w:p>
+        </w:tc>
+        <w:tc>
+          <w:tcPr>
+            <w:tcW w:w="563" w:type="dxa"/>
+            <w:tcBorders>
+              <w:top w:val="nil"/>
+              <w:left w:val="single" w:sz="4" w:space="0" w:color="auto"/>
+              <w:bottom w:val="nil"/>
+              <w:right w:val="single" w:sz="4" w:space="0" w:color="auto"/>
+            </w:tcBorders>
+          </w:tcPr>
+          <w:p>
+            <w:pPr>
+              <w:rPr>
+                <w:rFonts w:ascii="Times New Roman" w:hAnsi="Times New Roman" w:cs="Times New Roman"/>
+                <w:sz w:val="24"/>
+                <w:szCs w:val="24"/>
+                <w:lang w:val="en-US"/>
+              </w:rPr>
+            </w:pPr>
+          </w:p>
+        </w:tc>
+        <w:tc>
+          <w:tcPr>
+            <w:tcW w:w="571" w:type="dxa"/>
+            <w:tcBorders>
+              <w:top w:val="nil"/>
               <w:left w:val="single" w:sz="4" w:space="0" w:color="auto"/>
               <w:bottom w:val="nil"/>
               <w:right w:val="single" w:sz="12" w:space="0" w:color="auto"/>
@@ -4332,32 +4807,42 @@
         <w:tc>
           <w:tcPr>
             <w:tcW w:w="1887" w:type="dxa"/>
-            <w:vMerge/>
-            <w:tcBorders>
+            <w:vMerge w:val="restart"/>
+            <w:tcBorders>
+              <w:top w:val="single" w:sz="12" w:space="0" w:color="auto"/>
               <w:left w:val="single" w:sz="12" w:space="0" w:color="auto"/>
               <w:right w:val="single" w:sz="4" w:space="0" w:color="auto"/>
             </w:tcBorders>
-            <w:shd w:val="clear" w:color="auto" w:fill="A8D08D" w:themeFill="accent6" w:themeFillTint="99"/>
-          </w:tcPr>
-          <w:p>
-            <w:pPr>
-              <w:rPr>
-                <w:rFonts w:ascii="Times New Roman" w:hAnsi="Times New Roman" w:cs="Times New Roman"/>
-                <w:sz w:val="24"/>
-                <w:szCs w:val="24"/>
-                <w:lang w:val="en-US"/>
-              </w:rPr>
-            </w:pPr>
-          </w:p>
-        </w:tc>
-        <w:tc>
-          <w:tcPr>
-            <w:tcW w:w="2764" w:type="dxa"/>
-            <w:tcBorders>
+            <w:shd w:val="clear" w:color="auto" w:fill="8EAADB" w:themeFill="accent5" w:themeFillTint="99"/>
+          </w:tcPr>
+          <w:p>
+            <w:pPr>
+              <w:rPr>
+                <w:rFonts w:ascii="Times New Roman" w:hAnsi="Times New Roman" w:cs="Times New Roman"/>
+                <w:sz w:val="24"/>
+                <w:szCs w:val="24"/>
+                <w:lang w:val="en-US"/>
+              </w:rPr>
+            </w:pPr>
+            <w:r>
+              <w:rPr>
+                <w:rFonts w:ascii="Times New Roman" w:hAnsi="Times New Roman" w:cs="Times New Roman"/>
+                <w:sz w:val="24"/>
+                <w:szCs w:val="24"/>
+              </w:rPr>
+              <w:t>Cleaning</w:t>
+            </w:r>
+          </w:p>
+        </w:tc>
+        <w:tc>
+          <w:tcPr>
+            <w:tcW w:w="3910" w:type="dxa"/>
+            <w:tcBorders>
+              <w:top w:val="single" w:sz="12" w:space="0" w:color="auto"/>
               <w:left w:val="single" w:sz="4" w:space="0" w:color="auto"/>
               <w:right w:val="single" w:sz="12" w:space="0" w:color="auto"/>
             </w:tcBorders>
-            <w:shd w:val="clear" w:color="auto" w:fill="E2EFD9" w:themeFill="accent6" w:themeFillTint="33"/>
+            <w:shd w:val="clear" w:color="auto" w:fill="D9E2F3" w:themeFill="accent5" w:themeFillTint="33"/>
           </w:tcPr>
           <w:p>
             <w:pPr>
@@ -4375,13 +4860,13 @@
                 <w:szCs w:val="24"/>
                 <w:lang w:val="en-US"/>
               </w:rPr>
-              <w:t>Spot and mark outlier records</w:t>
+              <w:t>Normalize data</w:t>
             </w:r>
           </w:p>
         </w:tc>
         <w:tc>
           <w:tcPr>
-            <w:tcW w:w="672" w:type="dxa"/>
+            <w:tcW w:w="567" w:type="dxa"/>
             <w:tcBorders>
               <w:top w:val="nil"/>
               <w:left w:val="single" w:sz="12" w:space="0" w:color="auto"/>
@@ -4402,7 +4887,7 @@
         </w:tc>
         <w:tc>
           <w:tcPr>
-            <w:tcW w:w="608" w:type="dxa"/>
+            <w:tcW w:w="567" w:type="dxa"/>
             <w:tcBorders>
               <w:top w:val="nil"/>
               <w:left w:val="single" w:sz="4" w:space="0" w:color="auto"/>
@@ -4424,29 +4909,29 @@
         </w:tc>
         <w:tc>
           <w:tcPr>
-            <w:tcW w:w="717" w:type="dxa"/>
-            <w:gridSpan w:val="2"/>
+            <w:tcW w:w="567" w:type="dxa"/>
             <w:tcBorders>
               <w:top w:val="nil"/>
               <w:left w:val="single" w:sz="4" w:space="0" w:color="auto"/>
               <w:bottom w:val="nil"/>
               <w:right w:val="single" w:sz="4" w:space="0" w:color="auto"/>
             </w:tcBorders>
-          </w:tcPr>
-          <w:p>
-            <w:pPr>
-              <w:rPr>
-                <w:rFonts w:ascii="Times New Roman" w:hAnsi="Times New Roman" w:cs="Times New Roman"/>
-                <w:sz w:val="24"/>
-                <w:szCs w:val="24"/>
-                <w:lang w:val="en-US"/>
-              </w:rPr>
-            </w:pPr>
-          </w:p>
-        </w:tc>
-        <w:tc>
-          <w:tcPr>
-            <w:tcW w:w="700" w:type="dxa"/>
+            <w:shd w:val="clear" w:color="auto" w:fill="FFFFFF" w:themeFill="background1"/>
+          </w:tcPr>
+          <w:p>
+            <w:pPr>
+              <w:rPr>
+                <w:rFonts w:ascii="Times New Roman" w:hAnsi="Times New Roman" w:cs="Times New Roman"/>
+                <w:sz w:val="24"/>
+                <w:szCs w:val="24"/>
+                <w:lang w:val="en-US"/>
+              </w:rPr>
+            </w:pPr>
+          </w:p>
+        </w:tc>
+        <w:tc>
+          <w:tcPr>
+            <w:tcW w:w="567" w:type="dxa"/>
             <w:tcBorders>
               <w:top w:val="nil"/>
               <w:left w:val="single" w:sz="4" w:space="0" w:color="auto"/>
@@ -4467,7 +4952,7 @@
         </w:tc>
         <w:tc>
           <w:tcPr>
-            <w:tcW w:w="811" w:type="dxa"/>
+            <w:tcW w:w="567" w:type="dxa"/>
             <w:tcBorders>
               <w:top w:val="nil"/>
               <w:left w:val="single" w:sz="12" w:space="0" w:color="auto"/>
@@ -4488,7 +4973,7 @@
         </w:tc>
         <w:tc>
           <w:tcPr>
-            <w:tcW w:w="890" w:type="dxa"/>
+            <w:tcW w:w="567" w:type="dxa"/>
             <w:tcBorders>
               <w:top w:val="nil"/>
               <w:left w:val="single" w:sz="4" w:space="0" w:color="auto"/>
@@ -4509,7 +4994,233 @@
         </w:tc>
         <w:tc>
           <w:tcPr>
-            <w:tcW w:w="713" w:type="dxa"/>
+            <w:tcW w:w="563" w:type="dxa"/>
+            <w:tcBorders>
+              <w:top w:val="nil"/>
+              <w:left w:val="single" w:sz="4" w:space="0" w:color="auto"/>
+              <w:bottom w:val="nil"/>
+              <w:right w:val="single" w:sz="4" w:space="0" w:color="auto"/>
+            </w:tcBorders>
+          </w:tcPr>
+          <w:p>
+            <w:pPr>
+              <w:rPr>
+                <w:rFonts w:ascii="Times New Roman" w:hAnsi="Times New Roman" w:cs="Times New Roman"/>
+                <w:sz w:val="24"/>
+                <w:szCs w:val="24"/>
+                <w:lang w:val="en-US"/>
+              </w:rPr>
+            </w:pPr>
+          </w:p>
+        </w:tc>
+        <w:tc>
+          <w:tcPr>
+            <w:tcW w:w="571" w:type="dxa"/>
+            <w:tcBorders>
+              <w:top w:val="nil"/>
+              <w:left w:val="single" w:sz="4" w:space="0" w:color="auto"/>
+              <w:bottom w:val="nil"/>
+              <w:right w:val="single" w:sz="12" w:space="0" w:color="auto"/>
+            </w:tcBorders>
+          </w:tcPr>
+          <w:p>
+            <w:pPr>
+              <w:rPr>
+                <w:rFonts w:ascii="Times New Roman" w:hAnsi="Times New Roman" w:cs="Times New Roman"/>
+                <w:sz w:val="24"/>
+                <w:szCs w:val="24"/>
+                <w:lang w:val="en-US"/>
+              </w:rPr>
+            </w:pPr>
+          </w:p>
+        </w:tc>
+      </w:tr>
+      <w:tr>
+        <w:trPr>
+          <w:trHeight w:val="353"/>
+        </w:trPr>
+        <w:tc>
+          <w:tcPr>
+            <w:tcW w:w="1887" w:type="dxa"/>
+            <w:vMerge/>
+            <w:tcBorders>
+              <w:left w:val="single" w:sz="12" w:space="0" w:color="auto"/>
+              <w:bottom w:val="single" w:sz="12" w:space="0" w:color="auto"/>
+              <w:right w:val="single" w:sz="4" w:space="0" w:color="auto"/>
+            </w:tcBorders>
+            <w:shd w:val="clear" w:color="auto" w:fill="8EAADB" w:themeFill="accent5" w:themeFillTint="99"/>
+          </w:tcPr>
+          <w:p>
+            <w:pPr>
+              <w:rPr>
+                <w:rFonts w:ascii="Times New Roman" w:hAnsi="Times New Roman" w:cs="Times New Roman"/>
+                <w:sz w:val="24"/>
+                <w:szCs w:val="24"/>
+                <w:lang w:val="en-US"/>
+              </w:rPr>
+            </w:pPr>
+          </w:p>
+        </w:tc>
+        <w:tc>
+          <w:tcPr>
+            <w:tcW w:w="3910" w:type="dxa"/>
+            <w:tcBorders>
+              <w:left w:val="single" w:sz="4" w:space="0" w:color="auto"/>
+              <w:bottom w:val="single" w:sz="12" w:space="0" w:color="auto"/>
+              <w:right w:val="single" w:sz="12" w:space="0" w:color="auto"/>
+            </w:tcBorders>
+            <w:shd w:val="clear" w:color="auto" w:fill="D9E2F3" w:themeFill="accent5" w:themeFillTint="33"/>
+          </w:tcPr>
+          <w:p>
+            <w:pPr>
+              <w:rPr>
+                <w:rFonts w:ascii="Times New Roman" w:hAnsi="Times New Roman" w:cs="Times New Roman"/>
+                <w:sz w:val="24"/>
+                <w:szCs w:val="24"/>
+                <w:lang w:val="en-US"/>
+              </w:rPr>
+            </w:pPr>
+            <w:r>
+              <w:rPr>
+                <w:rFonts w:ascii="Times New Roman" w:hAnsi="Times New Roman" w:cs="Times New Roman"/>
+                <w:sz w:val="24"/>
+                <w:szCs w:val="24"/>
+              </w:rPr>
+              <w:t>Impute null values</w:t>
+            </w:r>
+          </w:p>
+        </w:tc>
+        <w:tc>
+          <w:tcPr>
+            <w:tcW w:w="567" w:type="dxa"/>
+            <w:tcBorders>
+              <w:top w:val="nil"/>
+              <w:left w:val="single" w:sz="12" w:space="0" w:color="auto"/>
+              <w:bottom w:val="nil"/>
+              <w:right w:val="single" w:sz="4" w:space="0" w:color="auto"/>
+            </w:tcBorders>
+          </w:tcPr>
+          <w:p>
+            <w:pPr>
+              <w:rPr>
+                <w:rFonts w:ascii="Times New Roman" w:hAnsi="Times New Roman" w:cs="Times New Roman"/>
+                <w:sz w:val="24"/>
+                <w:szCs w:val="24"/>
+                <w:lang w:val="en-US"/>
+              </w:rPr>
+            </w:pPr>
+          </w:p>
+        </w:tc>
+        <w:tc>
+          <w:tcPr>
+            <w:tcW w:w="567" w:type="dxa"/>
+            <w:tcBorders>
+              <w:top w:val="nil"/>
+              <w:left w:val="single" w:sz="4" w:space="0" w:color="auto"/>
+              <w:bottom w:val="nil"/>
+              <w:right w:val="single" w:sz="4" w:space="0" w:color="auto"/>
+            </w:tcBorders>
+            <w:shd w:val="clear" w:color="auto" w:fill="5B9BD5" w:themeFill="accent1"/>
+          </w:tcPr>
+          <w:p>
+            <w:pPr>
+              <w:rPr>
+                <w:rFonts w:ascii="Times New Roman" w:hAnsi="Times New Roman" w:cs="Times New Roman"/>
+                <w:sz w:val="24"/>
+                <w:szCs w:val="24"/>
+                <w:lang w:val="en-US"/>
+              </w:rPr>
+            </w:pPr>
+          </w:p>
+        </w:tc>
+        <w:tc>
+          <w:tcPr>
+            <w:tcW w:w="567" w:type="dxa"/>
+            <w:tcBorders>
+              <w:top w:val="nil"/>
+              <w:left w:val="single" w:sz="4" w:space="0" w:color="auto"/>
+              <w:bottom w:val="nil"/>
+              <w:right w:val="single" w:sz="4" w:space="0" w:color="auto"/>
+            </w:tcBorders>
+            <w:shd w:val="clear" w:color="auto" w:fill="FFFFFF" w:themeFill="background1"/>
+          </w:tcPr>
+          <w:p>
+            <w:pPr>
+              <w:rPr>
+                <w:rFonts w:ascii="Times New Roman" w:hAnsi="Times New Roman" w:cs="Times New Roman"/>
+                <w:sz w:val="24"/>
+                <w:szCs w:val="24"/>
+                <w:lang w:val="en-US"/>
+              </w:rPr>
+            </w:pPr>
+          </w:p>
+        </w:tc>
+        <w:tc>
+          <w:tcPr>
+            <w:tcW w:w="567" w:type="dxa"/>
+            <w:tcBorders>
+              <w:top w:val="nil"/>
+              <w:left w:val="single" w:sz="4" w:space="0" w:color="auto"/>
+              <w:bottom w:val="nil"/>
+              <w:right w:val="single" w:sz="12" w:space="0" w:color="auto"/>
+            </w:tcBorders>
+          </w:tcPr>
+          <w:p>
+            <w:pPr>
+              <w:rPr>
+                <w:rFonts w:ascii="Times New Roman" w:hAnsi="Times New Roman" w:cs="Times New Roman"/>
+                <w:sz w:val="24"/>
+                <w:szCs w:val="24"/>
+                <w:lang w:val="en-US"/>
+              </w:rPr>
+            </w:pPr>
+          </w:p>
+        </w:tc>
+        <w:tc>
+          <w:tcPr>
+            <w:tcW w:w="567" w:type="dxa"/>
+            <w:tcBorders>
+              <w:top w:val="nil"/>
+              <w:left w:val="single" w:sz="12" w:space="0" w:color="auto"/>
+              <w:bottom w:val="nil"/>
+              <w:right w:val="single" w:sz="4" w:space="0" w:color="auto"/>
+            </w:tcBorders>
+          </w:tcPr>
+          <w:p>
+            <w:pPr>
+              <w:rPr>
+                <w:rFonts w:ascii="Times New Roman" w:hAnsi="Times New Roman" w:cs="Times New Roman"/>
+                <w:sz w:val="24"/>
+                <w:szCs w:val="24"/>
+                <w:lang w:val="en-US"/>
+              </w:rPr>
+            </w:pPr>
+          </w:p>
+        </w:tc>
+        <w:tc>
+          <w:tcPr>
+            <w:tcW w:w="567" w:type="dxa"/>
+            <w:tcBorders>
+              <w:top w:val="nil"/>
+              <w:left w:val="single" w:sz="4" w:space="0" w:color="auto"/>
+              <w:bottom w:val="nil"/>
+              <w:right w:val="single" w:sz="4" w:space="0" w:color="auto"/>
+            </w:tcBorders>
+          </w:tcPr>
+          <w:p>
+            <w:pPr>
+              <w:rPr>
+                <w:rFonts w:ascii="Times New Roman" w:hAnsi="Times New Roman" w:cs="Times New Roman"/>
+                <w:sz w:val="24"/>
+                <w:szCs w:val="24"/>
+                <w:lang w:val="en-US"/>
+              </w:rPr>
+            </w:pPr>
+          </w:p>
+        </w:tc>
+        <w:tc>
+          <w:tcPr>
+            <w:tcW w:w="563" w:type="dxa"/>
             <w:tcBorders>
               <w:top w:val="nil"/>
               <w:left w:val="single" w:sz="4" w:space="0" w:color="auto"/>
@@ -4557,34 +5268,42 @@
         <w:tc>
           <w:tcPr>
             <w:tcW w:w="1887" w:type="dxa"/>
-            <w:vMerge/>
-            <w:tcBorders>
+            <w:vMerge w:val="restart"/>
+            <w:tcBorders>
+              <w:top w:val="single" w:sz="12" w:space="0" w:color="auto"/>
               <w:left w:val="single" w:sz="12" w:space="0" w:color="auto"/>
-              <w:bottom w:val="single" w:sz="12" w:space="0" w:color="auto"/>
               <w:right w:val="single" w:sz="4" w:space="0" w:color="auto"/>
             </w:tcBorders>
-            <w:shd w:val="clear" w:color="auto" w:fill="A8D08D" w:themeFill="accent6" w:themeFillTint="99"/>
-          </w:tcPr>
-          <w:p>
-            <w:pPr>
-              <w:rPr>
-                <w:rFonts w:ascii="Times New Roman" w:hAnsi="Times New Roman" w:cs="Times New Roman"/>
-                <w:sz w:val="24"/>
-                <w:szCs w:val="24"/>
-                <w:lang w:val="en-US"/>
-              </w:rPr>
-            </w:pPr>
-          </w:p>
-        </w:tc>
-        <w:tc>
-          <w:tcPr>
-            <w:tcW w:w="2764" w:type="dxa"/>
-            <w:tcBorders>
+            <w:shd w:val="clear" w:color="auto" w:fill="FFD966" w:themeFill="accent4" w:themeFillTint="99"/>
+          </w:tcPr>
+          <w:p>
+            <w:pPr>
+              <w:rPr>
+                <w:rFonts w:ascii="Times New Roman" w:hAnsi="Times New Roman" w:cs="Times New Roman"/>
+                <w:sz w:val="24"/>
+                <w:szCs w:val="24"/>
+                <w:lang w:val="en-US"/>
+              </w:rPr>
+            </w:pPr>
+            <w:r>
+              <w:rPr>
+                <w:rFonts w:ascii="Times New Roman" w:hAnsi="Times New Roman" w:cs="Times New Roman"/>
+                <w:sz w:val="24"/>
+                <w:szCs w:val="24"/>
+              </w:rPr>
+              <w:t>Feature Selection and Engineering</w:t>
+            </w:r>
+          </w:p>
+        </w:tc>
+        <w:tc>
+          <w:tcPr>
+            <w:tcW w:w="3910" w:type="dxa"/>
+            <w:tcBorders>
+              <w:top w:val="single" w:sz="12" w:space="0" w:color="auto"/>
               <w:left w:val="single" w:sz="4" w:space="0" w:color="auto"/>
-              <w:bottom w:val="single" w:sz="12" w:space="0" w:color="auto"/>
               <w:right w:val="single" w:sz="12" w:space="0" w:color="auto"/>
             </w:tcBorders>
-            <w:shd w:val="clear" w:color="auto" w:fill="E2EFD9" w:themeFill="accent6" w:themeFillTint="33"/>
+            <w:shd w:val="clear" w:color="auto" w:fill="FFF2CC" w:themeFill="accent4" w:themeFillTint="33"/>
           </w:tcPr>
           <w:p>
             <w:pPr>
@@ -4600,15 +5319,14 @@
                 <w:rFonts w:ascii="Times New Roman" w:hAnsi="Times New Roman" w:cs="Times New Roman"/>
                 <w:sz w:val="24"/>
                 <w:szCs w:val="24"/>
-                <w:lang w:val="en-US"/>
-              </w:rPr>
-              <w:t>Filter out redundant attributes</w:t>
+              </w:rPr>
+              <w:t>Further analysis using binning and density plots</w:t>
             </w:r>
           </w:p>
         </w:tc>
         <w:tc>
           <w:tcPr>
-            <w:tcW w:w="672" w:type="dxa"/>
+            <w:tcW w:w="567" w:type="dxa"/>
             <w:tcBorders>
               <w:top w:val="nil"/>
               <w:left w:val="single" w:sz="12" w:space="0" w:color="auto"/>
@@ -4629,93 +5347,94 @@
         </w:tc>
         <w:tc>
           <w:tcPr>
-            <w:tcW w:w="608" w:type="dxa"/>
+            <w:tcW w:w="567" w:type="dxa"/>
             <w:tcBorders>
               <w:top w:val="nil"/>
               <w:left w:val="single" w:sz="4" w:space="0" w:color="auto"/>
               <w:bottom w:val="nil"/>
               <w:right w:val="single" w:sz="4" w:space="0" w:color="auto"/>
             </w:tcBorders>
-            <w:shd w:val="clear" w:color="auto" w:fill="5B9BD5" w:themeFill="accent1"/>
-          </w:tcPr>
-          <w:p>
-            <w:pPr>
-              <w:rPr>
-                <w:rFonts w:ascii="Times New Roman" w:hAnsi="Times New Roman" w:cs="Times New Roman"/>
-                <w:sz w:val="24"/>
-                <w:szCs w:val="24"/>
-                <w:lang w:val="en-US"/>
-              </w:rPr>
-            </w:pPr>
-          </w:p>
-        </w:tc>
-        <w:tc>
-          <w:tcPr>
-            <w:tcW w:w="717" w:type="dxa"/>
-            <w:gridSpan w:val="2"/>
+          </w:tcPr>
+          <w:p>
+            <w:pPr>
+              <w:rPr>
+                <w:rFonts w:ascii="Times New Roman" w:hAnsi="Times New Roman" w:cs="Times New Roman"/>
+                <w:sz w:val="24"/>
+                <w:szCs w:val="24"/>
+                <w:lang w:val="en-US"/>
+              </w:rPr>
+            </w:pPr>
+          </w:p>
+        </w:tc>
+        <w:tc>
+          <w:tcPr>
+            <w:tcW w:w="567" w:type="dxa"/>
             <w:tcBorders>
               <w:top w:val="nil"/>
               <w:left w:val="single" w:sz="4" w:space="0" w:color="auto"/>
               <w:bottom w:val="nil"/>
               <w:right w:val="single" w:sz="4" w:space="0" w:color="auto"/>
             </w:tcBorders>
-          </w:tcPr>
-          <w:p>
-            <w:pPr>
-              <w:rPr>
-                <w:rFonts w:ascii="Times New Roman" w:hAnsi="Times New Roman" w:cs="Times New Roman"/>
-                <w:sz w:val="24"/>
-                <w:szCs w:val="24"/>
-                <w:lang w:val="en-US"/>
-              </w:rPr>
-            </w:pPr>
-          </w:p>
-        </w:tc>
-        <w:tc>
-          <w:tcPr>
-            <w:tcW w:w="700" w:type="dxa"/>
+            <w:shd w:val="clear" w:color="auto" w:fill="5B9BD5" w:themeFill="accent1"/>
+          </w:tcPr>
+          <w:p>
+            <w:pPr>
+              <w:rPr>
+                <w:rFonts w:ascii="Times New Roman" w:hAnsi="Times New Roman" w:cs="Times New Roman"/>
+                <w:sz w:val="24"/>
+                <w:szCs w:val="24"/>
+                <w:lang w:val="en-US"/>
+              </w:rPr>
+            </w:pPr>
+          </w:p>
+        </w:tc>
+        <w:tc>
+          <w:tcPr>
+            <w:tcW w:w="567" w:type="dxa"/>
             <w:tcBorders>
               <w:top w:val="nil"/>
               <w:left w:val="single" w:sz="4" w:space="0" w:color="auto"/>
               <w:bottom w:val="nil"/>
               <w:right w:val="single" w:sz="12" w:space="0" w:color="auto"/>
             </w:tcBorders>
-          </w:tcPr>
-          <w:p>
-            <w:pPr>
-              <w:rPr>
-                <w:rFonts w:ascii="Times New Roman" w:hAnsi="Times New Roman" w:cs="Times New Roman"/>
-                <w:sz w:val="24"/>
-                <w:szCs w:val="24"/>
-                <w:lang w:val="en-US"/>
-              </w:rPr>
-            </w:pPr>
-          </w:p>
-        </w:tc>
-        <w:tc>
-          <w:tcPr>
-            <w:tcW w:w="811" w:type="dxa"/>
+            <w:shd w:val="clear" w:color="auto" w:fill="5B9BD5" w:themeFill="accent1"/>
+          </w:tcPr>
+          <w:p>
+            <w:pPr>
+              <w:rPr>
+                <w:rFonts w:ascii="Times New Roman" w:hAnsi="Times New Roman" w:cs="Times New Roman"/>
+                <w:sz w:val="24"/>
+                <w:szCs w:val="24"/>
+                <w:lang w:val="en-US"/>
+              </w:rPr>
+            </w:pPr>
+          </w:p>
+        </w:tc>
+        <w:tc>
+          <w:tcPr>
+            <w:tcW w:w="567" w:type="dxa"/>
             <w:tcBorders>
               <w:top w:val="nil"/>
               <w:left w:val="single" w:sz="12" w:space="0" w:color="auto"/>
               <w:bottom w:val="nil"/>
               <w:right w:val="single" w:sz="4" w:space="0" w:color="auto"/>
             </w:tcBorders>
-          </w:tcPr>
-          <w:p>
-            <w:pPr>
-              <w:rPr>
-                <w:rFonts w:ascii="Times New Roman" w:hAnsi="Times New Roman" w:cs="Times New Roman"/>
-                <w:sz w:val="24"/>
-                <w:szCs w:val="24"/>
-                <w:lang w:val="en-US"/>
-              </w:rPr>
-            </w:pPr>
-          </w:p>
-        </w:tc>
-        <w:tc>
-          <w:tcPr>
-            <w:tcW w:w="890" w:type="dxa"/>
+            <w:shd w:val="clear" w:color="auto" w:fill="FFFFFF" w:themeFill="background1"/>
+          </w:tcPr>
+          <w:p>
+            <w:pPr>
+              <w:rPr>
+                <w:rFonts w:ascii="Times New Roman" w:hAnsi="Times New Roman" w:cs="Times New Roman"/>
+                <w:sz w:val="24"/>
+                <w:szCs w:val="24"/>
+                <w:lang w:val="en-US"/>
+              </w:rPr>
+            </w:pPr>
+          </w:p>
+        </w:tc>
+        <w:tc>
+          <w:tcPr>
+            <w:tcW w:w="567" w:type="dxa"/>
             <w:tcBorders>
               <w:top w:val="nil"/>
               <w:left w:val="single" w:sz="4" w:space="0" w:color="auto"/>
@@ -4736,7 +5455,7 @@
         </w:tc>
         <w:tc>
           <w:tcPr>
-            <w:tcW w:w="713" w:type="dxa"/>
+            <w:tcW w:w="563" w:type="dxa"/>
             <w:tcBorders>
               <w:top w:val="nil"/>
               <w:left w:val="single" w:sz="4" w:space="0" w:color="auto"/>
@@ -4784,42 +5503,32 @@
         <w:tc>
           <w:tcPr>
             <w:tcW w:w="1887" w:type="dxa"/>
-            <w:vMerge w:val="restart"/>
-            <w:tcBorders>
-              <w:top w:val="single" w:sz="12" w:space="0" w:color="auto"/>
+            <w:vMerge/>
+            <w:tcBorders>
               <w:left w:val="single" w:sz="12" w:space="0" w:color="auto"/>
               <w:right w:val="single" w:sz="4" w:space="0" w:color="auto"/>
             </w:tcBorders>
-            <w:shd w:val="clear" w:color="auto" w:fill="8EAADB" w:themeFill="accent5" w:themeFillTint="99"/>
-          </w:tcPr>
-          <w:p>
-            <w:pPr>
-              <w:rPr>
-                <w:rFonts w:ascii="Times New Roman" w:hAnsi="Times New Roman" w:cs="Times New Roman"/>
-                <w:sz w:val="24"/>
-                <w:szCs w:val="24"/>
-                <w:lang w:val="en-US"/>
-              </w:rPr>
-            </w:pPr>
-            <w:r>
-              <w:rPr>
-                <w:rFonts w:ascii="Times New Roman" w:hAnsi="Times New Roman" w:cs="Times New Roman"/>
-                <w:sz w:val="24"/>
-                <w:szCs w:val="24"/>
-              </w:rPr>
-              <w:t>Cleaning</w:t>
-            </w:r>
-          </w:p>
-        </w:tc>
-        <w:tc>
-          <w:tcPr>
-            <w:tcW w:w="2764" w:type="dxa"/>
-            <w:tcBorders>
-              <w:top w:val="single" w:sz="12" w:space="0" w:color="auto"/>
+            <w:shd w:val="clear" w:color="auto" w:fill="FFD966" w:themeFill="accent4" w:themeFillTint="99"/>
+          </w:tcPr>
+          <w:p>
+            <w:pPr>
+              <w:rPr>
+                <w:rFonts w:ascii="Times New Roman" w:hAnsi="Times New Roman" w:cs="Times New Roman"/>
+                <w:sz w:val="24"/>
+                <w:szCs w:val="24"/>
+                <w:lang w:val="en-US"/>
+              </w:rPr>
+            </w:pPr>
+          </w:p>
+        </w:tc>
+        <w:tc>
+          <w:tcPr>
+            <w:tcW w:w="3910" w:type="dxa"/>
+            <w:tcBorders>
               <w:left w:val="single" w:sz="4" w:space="0" w:color="auto"/>
               <w:right w:val="single" w:sz="12" w:space="0" w:color="auto"/>
             </w:tcBorders>
-            <w:shd w:val="clear" w:color="auto" w:fill="D9E2F3" w:themeFill="accent5" w:themeFillTint="33"/>
+            <w:shd w:val="clear" w:color="auto" w:fill="FFF2CC" w:themeFill="accent4" w:themeFillTint="33"/>
           </w:tcPr>
           <w:p>
             <w:pPr>
@@ -4835,15 +5544,14 @@
                 <w:rFonts w:ascii="Times New Roman" w:hAnsi="Times New Roman" w:cs="Times New Roman"/>
                 <w:sz w:val="24"/>
                 <w:szCs w:val="24"/>
-                <w:lang w:val="en-US"/>
-              </w:rPr>
-              <w:t>Normalize data</w:t>
+              </w:rPr>
+              <w:t>Create new meaningful attributes</w:t>
             </w:r>
           </w:p>
         </w:tc>
         <w:tc>
           <w:tcPr>
-            <w:tcW w:w="672" w:type="dxa"/>
+            <w:tcW w:w="567" w:type="dxa"/>
             <w:tcBorders>
               <w:top w:val="nil"/>
               <w:left w:val="single" w:sz="12" w:space="0" w:color="auto"/>
@@ -4864,115 +5572,115 @@
         </w:tc>
         <w:tc>
           <w:tcPr>
-            <w:tcW w:w="608" w:type="dxa"/>
+            <w:tcW w:w="567" w:type="dxa"/>
             <w:tcBorders>
               <w:top w:val="nil"/>
               <w:left w:val="single" w:sz="4" w:space="0" w:color="auto"/>
               <w:bottom w:val="nil"/>
               <w:right w:val="single" w:sz="4" w:space="0" w:color="auto"/>
             </w:tcBorders>
-            <w:shd w:val="clear" w:color="auto" w:fill="5B9BD5" w:themeFill="accent1"/>
-          </w:tcPr>
-          <w:p>
-            <w:pPr>
-              <w:rPr>
-                <w:rFonts w:ascii="Times New Roman" w:hAnsi="Times New Roman" w:cs="Times New Roman"/>
-                <w:sz w:val="24"/>
-                <w:szCs w:val="24"/>
-                <w:lang w:val="en-US"/>
-              </w:rPr>
-            </w:pPr>
-          </w:p>
-        </w:tc>
-        <w:tc>
-          <w:tcPr>
-            <w:tcW w:w="717" w:type="dxa"/>
-            <w:gridSpan w:val="2"/>
+          </w:tcPr>
+          <w:p>
+            <w:pPr>
+              <w:rPr>
+                <w:rFonts w:ascii="Times New Roman" w:hAnsi="Times New Roman" w:cs="Times New Roman"/>
+                <w:sz w:val="24"/>
+                <w:szCs w:val="24"/>
+                <w:lang w:val="en-US"/>
+              </w:rPr>
+            </w:pPr>
+          </w:p>
+        </w:tc>
+        <w:tc>
+          <w:tcPr>
+            <w:tcW w:w="567" w:type="dxa"/>
             <w:tcBorders>
               <w:top w:val="nil"/>
               <w:left w:val="single" w:sz="4" w:space="0" w:color="auto"/>
               <w:bottom w:val="nil"/>
               <w:right w:val="single" w:sz="4" w:space="0" w:color="auto"/>
             </w:tcBorders>
-            <w:shd w:val="clear" w:color="auto" w:fill="FFFFFF" w:themeFill="background1"/>
-          </w:tcPr>
-          <w:p>
-            <w:pPr>
-              <w:rPr>
-                <w:rFonts w:ascii="Times New Roman" w:hAnsi="Times New Roman" w:cs="Times New Roman"/>
-                <w:sz w:val="24"/>
-                <w:szCs w:val="24"/>
-                <w:lang w:val="en-US"/>
-              </w:rPr>
-            </w:pPr>
-          </w:p>
-        </w:tc>
-        <w:tc>
-          <w:tcPr>
-            <w:tcW w:w="700" w:type="dxa"/>
+          </w:tcPr>
+          <w:p>
+            <w:pPr>
+              <w:rPr>
+                <w:rFonts w:ascii="Times New Roman" w:hAnsi="Times New Roman" w:cs="Times New Roman"/>
+                <w:sz w:val="24"/>
+                <w:szCs w:val="24"/>
+                <w:lang w:val="en-US"/>
+              </w:rPr>
+            </w:pPr>
+          </w:p>
+        </w:tc>
+        <w:tc>
+          <w:tcPr>
+            <w:tcW w:w="567" w:type="dxa"/>
             <w:tcBorders>
               <w:top w:val="nil"/>
               <w:left w:val="single" w:sz="4" w:space="0" w:color="auto"/>
               <w:bottom w:val="nil"/>
               <w:right w:val="single" w:sz="12" w:space="0" w:color="auto"/>
             </w:tcBorders>
-          </w:tcPr>
-          <w:p>
-            <w:pPr>
-              <w:rPr>
-                <w:rFonts w:ascii="Times New Roman" w:hAnsi="Times New Roman" w:cs="Times New Roman"/>
-                <w:sz w:val="24"/>
-                <w:szCs w:val="24"/>
-                <w:lang w:val="en-US"/>
-              </w:rPr>
-            </w:pPr>
-          </w:p>
-        </w:tc>
-        <w:tc>
-          <w:tcPr>
-            <w:tcW w:w="811" w:type="dxa"/>
+            <w:shd w:val="clear" w:color="auto" w:fill="5B9BD5" w:themeFill="accent1"/>
+          </w:tcPr>
+          <w:p>
+            <w:pPr>
+              <w:rPr>
+                <w:rFonts w:ascii="Times New Roman" w:hAnsi="Times New Roman" w:cs="Times New Roman"/>
+                <w:sz w:val="24"/>
+                <w:szCs w:val="24"/>
+                <w:lang w:val="en-US"/>
+              </w:rPr>
+            </w:pPr>
+          </w:p>
+        </w:tc>
+        <w:tc>
+          <w:tcPr>
+            <w:tcW w:w="567" w:type="dxa"/>
             <w:tcBorders>
               <w:top w:val="nil"/>
               <w:left w:val="single" w:sz="12" w:space="0" w:color="auto"/>
               <w:bottom w:val="nil"/>
               <w:right w:val="single" w:sz="4" w:space="0" w:color="auto"/>
             </w:tcBorders>
-          </w:tcPr>
-          <w:p>
-            <w:pPr>
-              <w:rPr>
-                <w:rFonts w:ascii="Times New Roman" w:hAnsi="Times New Roman" w:cs="Times New Roman"/>
-                <w:sz w:val="24"/>
-                <w:szCs w:val="24"/>
-                <w:lang w:val="en-US"/>
-              </w:rPr>
-            </w:pPr>
-          </w:p>
-        </w:tc>
-        <w:tc>
-          <w:tcPr>
-            <w:tcW w:w="890" w:type="dxa"/>
+            <w:shd w:val="clear" w:color="auto" w:fill="5B9BD5" w:themeFill="accent1"/>
+          </w:tcPr>
+          <w:p>
+            <w:pPr>
+              <w:rPr>
+                <w:rFonts w:ascii="Times New Roman" w:hAnsi="Times New Roman" w:cs="Times New Roman"/>
+                <w:sz w:val="24"/>
+                <w:szCs w:val="24"/>
+                <w:lang w:val="en-US"/>
+              </w:rPr>
+            </w:pPr>
+          </w:p>
+        </w:tc>
+        <w:tc>
+          <w:tcPr>
+            <w:tcW w:w="567" w:type="dxa"/>
             <w:tcBorders>
               <w:top w:val="nil"/>
               <w:left w:val="single" w:sz="4" w:space="0" w:color="auto"/>
               <w:bottom w:val="nil"/>
               <w:right w:val="single" w:sz="4" w:space="0" w:color="auto"/>
             </w:tcBorders>
-          </w:tcPr>
-          <w:p>
-            <w:pPr>
-              <w:rPr>
-                <w:rFonts w:ascii="Times New Roman" w:hAnsi="Times New Roman" w:cs="Times New Roman"/>
-                <w:sz w:val="24"/>
-                <w:szCs w:val="24"/>
-                <w:lang w:val="en-US"/>
-              </w:rPr>
-            </w:pPr>
-          </w:p>
-        </w:tc>
-        <w:tc>
-          <w:tcPr>
-            <w:tcW w:w="713" w:type="dxa"/>
+            <w:shd w:val="clear" w:color="auto" w:fill="FFFFFF" w:themeFill="background1"/>
+          </w:tcPr>
+          <w:p>
+            <w:pPr>
+              <w:rPr>
+                <w:rFonts w:ascii="Times New Roman" w:hAnsi="Times New Roman" w:cs="Times New Roman"/>
+                <w:sz w:val="24"/>
+                <w:szCs w:val="24"/>
+                <w:lang w:val="en-US"/>
+              </w:rPr>
+            </w:pPr>
+          </w:p>
+        </w:tc>
+        <w:tc>
+          <w:tcPr>
+            <w:tcW w:w="563" w:type="dxa"/>
             <w:tcBorders>
               <w:top w:val="nil"/>
               <w:left w:val="single" w:sz="4" w:space="0" w:color="auto"/>
@@ -5026,28 +5734,28 @@
               <w:bottom w:val="single" w:sz="12" w:space="0" w:color="auto"/>
               <w:right w:val="single" w:sz="4" w:space="0" w:color="auto"/>
             </w:tcBorders>
-            <w:shd w:val="clear" w:color="auto" w:fill="8EAADB" w:themeFill="accent5" w:themeFillTint="99"/>
-          </w:tcPr>
-          <w:p>
-            <w:pPr>
-              <w:rPr>
-                <w:rFonts w:ascii="Times New Roman" w:hAnsi="Times New Roman" w:cs="Times New Roman"/>
-                <w:sz w:val="24"/>
-                <w:szCs w:val="24"/>
-                <w:lang w:val="en-US"/>
-              </w:rPr>
-            </w:pPr>
-          </w:p>
-        </w:tc>
-        <w:tc>
-          <w:tcPr>
-            <w:tcW w:w="2764" w:type="dxa"/>
+            <w:shd w:val="clear" w:color="auto" w:fill="FFD966" w:themeFill="accent4" w:themeFillTint="99"/>
+          </w:tcPr>
+          <w:p>
+            <w:pPr>
+              <w:rPr>
+                <w:rFonts w:ascii="Times New Roman" w:hAnsi="Times New Roman" w:cs="Times New Roman"/>
+                <w:sz w:val="24"/>
+                <w:szCs w:val="24"/>
+                <w:lang w:val="en-US"/>
+              </w:rPr>
+            </w:pPr>
+          </w:p>
+        </w:tc>
+        <w:tc>
+          <w:tcPr>
+            <w:tcW w:w="3910" w:type="dxa"/>
             <w:tcBorders>
               <w:left w:val="single" w:sz="4" w:space="0" w:color="auto"/>
               <w:bottom w:val="single" w:sz="12" w:space="0" w:color="auto"/>
               <w:right w:val="single" w:sz="12" w:space="0" w:color="auto"/>
             </w:tcBorders>
-            <w:shd w:val="clear" w:color="auto" w:fill="D9E2F3" w:themeFill="accent5" w:themeFillTint="33"/>
+            <w:shd w:val="clear" w:color="auto" w:fill="FFF2CC" w:themeFill="accent4" w:themeFillTint="33"/>
           </w:tcPr>
           <w:p>
             <w:pPr>
@@ -5064,13 +5772,13 @@
                 <w:sz w:val="24"/>
                 <w:szCs w:val="24"/>
               </w:rPr>
-              <w:t>Impute null values</w:t>
+              <w:t>Fit a classification model</w:t>
             </w:r>
           </w:p>
         </w:tc>
         <w:tc>
           <w:tcPr>
-            <w:tcW w:w="672" w:type="dxa"/>
+            <w:tcW w:w="567" w:type="dxa"/>
             <w:tcBorders>
               <w:top w:val="nil"/>
               <w:left w:val="single" w:sz="12" w:space="0" w:color="auto"/>
@@ -5091,52 +5799,49 @@
         </w:tc>
         <w:tc>
           <w:tcPr>
-            <w:tcW w:w="608" w:type="dxa"/>
+            <w:tcW w:w="567" w:type="dxa"/>
             <w:tcBorders>
               <w:top w:val="nil"/>
               <w:left w:val="single" w:sz="4" w:space="0" w:color="auto"/>
               <w:bottom w:val="nil"/>
               <w:right w:val="single" w:sz="4" w:space="0" w:color="auto"/>
             </w:tcBorders>
-            <w:shd w:val="clear" w:color="auto" w:fill="5B9BD5" w:themeFill="accent1"/>
-          </w:tcPr>
-          <w:p>
-            <w:pPr>
-              <w:rPr>
-                <w:rFonts w:ascii="Times New Roman" w:hAnsi="Times New Roman" w:cs="Times New Roman"/>
-                <w:sz w:val="24"/>
-                <w:szCs w:val="24"/>
-                <w:lang w:val="en-US"/>
-              </w:rPr>
-            </w:pPr>
-          </w:p>
-        </w:tc>
-        <w:tc>
-          <w:tcPr>
-            <w:tcW w:w="717" w:type="dxa"/>
-            <w:gridSpan w:val="2"/>
+          </w:tcPr>
+          <w:p>
+            <w:pPr>
+              <w:rPr>
+                <w:rFonts w:ascii="Times New Roman" w:hAnsi="Times New Roman" w:cs="Times New Roman"/>
+                <w:sz w:val="24"/>
+                <w:szCs w:val="24"/>
+                <w:lang w:val="en-US"/>
+              </w:rPr>
+            </w:pPr>
+          </w:p>
+        </w:tc>
+        <w:tc>
+          <w:tcPr>
+            <w:tcW w:w="567" w:type="dxa"/>
             <w:tcBorders>
               <w:top w:val="nil"/>
               <w:left w:val="single" w:sz="4" w:space="0" w:color="auto"/>
               <w:bottom w:val="nil"/>
               <w:right w:val="single" w:sz="4" w:space="0" w:color="auto"/>
             </w:tcBorders>
-            <w:shd w:val="clear" w:color="auto" w:fill="FFFFFF" w:themeFill="background1"/>
-          </w:tcPr>
-          <w:p>
-            <w:pPr>
-              <w:rPr>
-                <w:rFonts w:ascii="Times New Roman" w:hAnsi="Times New Roman" w:cs="Times New Roman"/>
-                <w:sz w:val="24"/>
-                <w:szCs w:val="24"/>
-                <w:lang w:val="en-US"/>
-              </w:rPr>
-            </w:pPr>
-          </w:p>
-        </w:tc>
-        <w:tc>
-          <w:tcPr>
-            <w:tcW w:w="700" w:type="dxa"/>
+          </w:tcPr>
+          <w:p>
+            <w:pPr>
+              <w:rPr>
+                <w:rFonts w:ascii="Times New Roman" w:hAnsi="Times New Roman" w:cs="Times New Roman"/>
+                <w:sz w:val="24"/>
+                <w:szCs w:val="24"/>
+                <w:lang w:val="en-US"/>
+              </w:rPr>
+            </w:pPr>
+          </w:p>
+        </w:tc>
+        <w:tc>
+          <w:tcPr>
+            <w:tcW w:w="567" w:type="dxa"/>
             <w:tcBorders>
               <w:top w:val="nil"/>
               <w:left w:val="single" w:sz="4" w:space="0" w:color="auto"/>
@@ -5157,49 +5862,285 @@
         </w:tc>
         <w:tc>
           <w:tcPr>
-            <w:tcW w:w="811" w:type="dxa"/>
+            <w:tcW w:w="567" w:type="dxa"/>
             <w:tcBorders>
               <w:top w:val="nil"/>
               <w:left w:val="single" w:sz="12" w:space="0" w:color="auto"/>
               <w:bottom w:val="nil"/>
               <w:right w:val="single" w:sz="4" w:space="0" w:color="auto"/>
             </w:tcBorders>
-          </w:tcPr>
-          <w:p>
-            <w:pPr>
-              <w:rPr>
-                <w:rFonts w:ascii="Times New Roman" w:hAnsi="Times New Roman" w:cs="Times New Roman"/>
-                <w:sz w:val="24"/>
-                <w:szCs w:val="24"/>
-                <w:lang w:val="en-US"/>
-              </w:rPr>
-            </w:pPr>
-          </w:p>
-        </w:tc>
-        <w:tc>
-          <w:tcPr>
-            <w:tcW w:w="890" w:type="dxa"/>
+            <w:shd w:val="clear" w:color="auto" w:fill="5B9BD5" w:themeFill="accent1"/>
+          </w:tcPr>
+          <w:p>
+            <w:pPr>
+              <w:rPr>
+                <w:rFonts w:ascii="Times New Roman" w:hAnsi="Times New Roman" w:cs="Times New Roman"/>
+                <w:sz w:val="24"/>
+                <w:szCs w:val="24"/>
+                <w:lang w:val="en-US"/>
+              </w:rPr>
+            </w:pPr>
+          </w:p>
+        </w:tc>
+        <w:tc>
+          <w:tcPr>
+            <w:tcW w:w="567" w:type="dxa"/>
             <w:tcBorders>
               <w:top w:val="nil"/>
               <w:left w:val="single" w:sz="4" w:space="0" w:color="auto"/>
               <w:bottom w:val="nil"/>
               <w:right w:val="single" w:sz="4" w:space="0" w:color="auto"/>
             </w:tcBorders>
-          </w:tcPr>
-          <w:p>
-            <w:pPr>
-              <w:rPr>
-                <w:rFonts w:ascii="Times New Roman" w:hAnsi="Times New Roman" w:cs="Times New Roman"/>
-                <w:sz w:val="24"/>
-                <w:szCs w:val="24"/>
-                <w:lang w:val="en-US"/>
-              </w:rPr>
-            </w:pPr>
-          </w:p>
-        </w:tc>
-        <w:tc>
-          <w:tcPr>
-            <w:tcW w:w="713" w:type="dxa"/>
+            <w:shd w:val="clear" w:color="auto" w:fill="FFFFFF" w:themeFill="background1"/>
+          </w:tcPr>
+          <w:p>
+            <w:pPr>
+              <w:rPr>
+                <w:rFonts w:ascii="Times New Roman" w:hAnsi="Times New Roman" w:cs="Times New Roman"/>
+                <w:sz w:val="24"/>
+                <w:szCs w:val="24"/>
+                <w:lang w:val="en-US"/>
+              </w:rPr>
+            </w:pPr>
+          </w:p>
+        </w:tc>
+        <w:tc>
+          <w:tcPr>
+            <w:tcW w:w="563" w:type="dxa"/>
+            <w:tcBorders>
+              <w:top w:val="nil"/>
+              <w:left w:val="single" w:sz="4" w:space="0" w:color="auto"/>
+              <w:bottom w:val="nil"/>
+              <w:right w:val="single" w:sz="4" w:space="0" w:color="auto"/>
+            </w:tcBorders>
+          </w:tcPr>
+          <w:p>
+            <w:pPr>
+              <w:rPr>
+                <w:rFonts w:ascii="Times New Roman" w:hAnsi="Times New Roman" w:cs="Times New Roman"/>
+                <w:sz w:val="24"/>
+                <w:szCs w:val="24"/>
+                <w:lang w:val="en-US"/>
+              </w:rPr>
+            </w:pPr>
+          </w:p>
+        </w:tc>
+        <w:tc>
+          <w:tcPr>
+            <w:tcW w:w="571" w:type="dxa"/>
+            <w:tcBorders>
+              <w:top w:val="nil"/>
+              <w:left w:val="single" w:sz="4" w:space="0" w:color="auto"/>
+              <w:bottom w:val="nil"/>
+              <w:right w:val="single" w:sz="12" w:space="0" w:color="auto"/>
+            </w:tcBorders>
+          </w:tcPr>
+          <w:p>
+            <w:pPr>
+              <w:rPr>
+                <w:rFonts w:ascii="Times New Roman" w:hAnsi="Times New Roman" w:cs="Times New Roman"/>
+                <w:sz w:val="24"/>
+                <w:szCs w:val="24"/>
+                <w:lang w:val="en-US"/>
+              </w:rPr>
+            </w:pPr>
+          </w:p>
+        </w:tc>
+      </w:tr>
+      <w:tr>
+        <w:trPr>
+          <w:trHeight w:val="353"/>
+        </w:trPr>
+        <w:tc>
+          <w:tcPr>
+            <w:tcW w:w="1887" w:type="dxa"/>
+            <w:vMerge w:val="restart"/>
+            <w:tcBorders>
+              <w:top w:val="single" w:sz="12" w:space="0" w:color="auto"/>
+              <w:left w:val="single" w:sz="12" w:space="0" w:color="auto"/>
+              <w:right w:val="single" w:sz="4" w:space="0" w:color="auto"/>
+            </w:tcBorders>
+            <w:shd w:val="clear" w:color="auto" w:fill="F4B083" w:themeFill="accent2" w:themeFillTint="99"/>
+          </w:tcPr>
+          <w:p>
+            <w:pPr>
+              <w:rPr>
+                <w:rFonts w:ascii="Times New Roman" w:hAnsi="Times New Roman" w:cs="Times New Roman"/>
+                <w:sz w:val="24"/>
+                <w:szCs w:val="24"/>
+                <w:lang w:val="en-US"/>
+              </w:rPr>
+            </w:pPr>
+            <w:r>
+              <w:rPr>
+                <w:rFonts w:ascii="Times New Roman" w:hAnsi="Times New Roman" w:cs="Times New Roman"/>
+                <w:sz w:val="24"/>
+                <w:szCs w:val="24"/>
+              </w:rPr>
+              <w:t>Aggregate Past Data</w:t>
+            </w:r>
+          </w:p>
+        </w:tc>
+        <w:tc>
+          <w:tcPr>
+            <w:tcW w:w="3910" w:type="dxa"/>
+            <w:tcBorders>
+              <w:top w:val="single" w:sz="12" w:space="0" w:color="auto"/>
+              <w:left w:val="single" w:sz="4" w:space="0" w:color="auto"/>
+              <w:right w:val="single" w:sz="12" w:space="0" w:color="auto"/>
+            </w:tcBorders>
+            <w:shd w:val="clear" w:color="auto" w:fill="FBE4D5" w:themeFill="accent2" w:themeFillTint="33"/>
+          </w:tcPr>
+          <w:p>
+            <w:pPr>
+              <w:rPr>
+                <w:rFonts w:ascii="Times New Roman" w:hAnsi="Times New Roman" w:cs="Times New Roman"/>
+                <w:sz w:val="24"/>
+                <w:szCs w:val="24"/>
+                <w:lang w:val="en-US"/>
+              </w:rPr>
+            </w:pPr>
+            <w:r>
+              <w:rPr>
+                <w:rFonts w:ascii="Times New Roman" w:hAnsi="Times New Roman" w:cs="Times New Roman"/>
+                <w:sz w:val="24"/>
+                <w:szCs w:val="24"/>
+              </w:rPr>
+              <w:t>Grouping and aggregation</w:t>
+            </w:r>
+          </w:p>
+        </w:tc>
+        <w:tc>
+          <w:tcPr>
+            <w:tcW w:w="567" w:type="dxa"/>
+            <w:tcBorders>
+              <w:top w:val="nil"/>
+              <w:left w:val="single" w:sz="12" w:space="0" w:color="auto"/>
+              <w:bottom w:val="nil"/>
+              <w:right w:val="single" w:sz="4" w:space="0" w:color="auto"/>
+            </w:tcBorders>
+          </w:tcPr>
+          <w:p>
+            <w:pPr>
+              <w:rPr>
+                <w:rFonts w:ascii="Times New Roman" w:hAnsi="Times New Roman" w:cs="Times New Roman"/>
+                <w:sz w:val="24"/>
+                <w:szCs w:val="24"/>
+                <w:lang w:val="en-US"/>
+              </w:rPr>
+            </w:pPr>
+          </w:p>
+        </w:tc>
+        <w:tc>
+          <w:tcPr>
+            <w:tcW w:w="567" w:type="dxa"/>
+            <w:tcBorders>
+              <w:top w:val="nil"/>
+              <w:left w:val="single" w:sz="4" w:space="0" w:color="auto"/>
+              <w:bottom w:val="nil"/>
+              <w:right w:val="single" w:sz="4" w:space="0" w:color="auto"/>
+            </w:tcBorders>
+          </w:tcPr>
+          <w:p>
+            <w:pPr>
+              <w:rPr>
+                <w:rFonts w:ascii="Times New Roman" w:hAnsi="Times New Roman" w:cs="Times New Roman"/>
+                <w:sz w:val="24"/>
+                <w:szCs w:val="24"/>
+                <w:lang w:val="en-US"/>
+              </w:rPr>
+            </w:pPr>
+          </w:p>
+        </w:tc>
+        <w:tc>
+          <w:tcPr>
+            <w:tcW w:w="567" w:type="dxa"/>
+            <w:tcBorders>
+              <w:top w:val="nil"/>
+              <w:left w:val="single" w:sz="4" w:space="0" w:color="auto"/>
+              <w:bottom w:val="nil"/>
+              <w:right w:val="single" w:sz="4" w:space="0" w:color="auto"/>
+            </w:tcBorders>
+            <w:shd w:val="clear" w:color="auto" w:fill="5B9BD5" w:themeFill="accent1"/>
+          </w:tcPr>
+          <w:p>
+            <w:pPr>
+              <w:rPr>
+                <w:rFonts w:ascii="Times New Roman" w:hAnsi="Times New Roman" w:cs="Times New Roman"/>
+                <w:sz w:val="24"/>
+                <w:szCs w:val="24"/>
+                <w:lang w:val="en-US"/>
+              </w:rPr>
+            </w:pPr>
+          </w:p>
+        </w:tc>
+        <w:tc>
+          <w:tcPr>
+            <w:tcW w:w="567" w:type="dxa"/>
+            <w:tcBorders>
+              <w:top w:val="nil"/>
+              <w:left w:val="single" w:sz="4" w:space="0" w:color="auto"/>
+              <w:bottom w:val="nil"/>
+              <w:right w:val="single" w:sz="12" w:space="0" w:color="auto"/>
+            </w:tcBorders>
+            <w:shd w:val="clear" w:color="auto" w:fill="5B9BD5" w:themeFill="accent1"/>
+          </w:tcPr>
+          <w:p>
+            <w:pPr>
+              <w:rPr>
+                <w:rFonts w:ascii="Times New Roman" w:hAnsi="Times New Roman" w:cs="Times New Roman"/>
+                <w:sz w:val="24"/>
+                <w:szCs w:val="24"/>
+                <w:lang w:val="en-US"/>
+              </w:rPr>
+            </w:pPr>
+          </w:p>
+        </w:tc>
+        <w:tc>
+          <w:tcPr>
+            <w:tcW w:w="567" w:type="dxa"/>
+            <w:tcBorders>
+              <w:top w:val="nil"/>
+              <w:left w:val="single" w:sz="12" w:space="0" w:color="auto"/>
+              <w:bottom w:val="nil"/>
+              <w:right w:val="single" w:sz="4" w:space="0" w:color="auto"/>
+            </w:tcBorders>
+          </w:tcPr>
+          <w:p>
+            <w:pPr>
+              <w:rPr>
+                <w:rFonts w:ascii="Times New Roman" w:hAnsi="Times New Roman" w:cs="Times New Roman"/>
+                <w:sz w:val="24"/>
+                <w:szCs w:val="24"/>
+                <w:lang w:val="en-US"/>
+              </w:rPr>
+            </w:pPr>
+          </w:p>
+        </w:tc>
+        <w:tc>
+          <w:tcPr>
+            <w:tcW w:w="567" w:type="dxa"/>
+            <w:tcBorders>
+              <w:top w:val="nil"/>
+              <w:left w:val="single" w:sz="4" w:space="0" w:color="auto"/>
+              <w:bottom w:val="nil"/>
+              <w:right w:val="single" w:sz="4" w:space="0" w:color="auto"/>
+            </w:tcBorders>
+          </w:tcPr>
+          <w:p>
+            <w:pPr>
+              <w:rPr>
+                <w:rFonts w:ascii="Times New Roman" w:hAnsi="Times New Roman" w:cs="Times New Roman"/>
+                <w:sz w:val="24"/>
+                <w:szCs w:val="24"/>
+                <w:lang w:val="en-US"/>
+              </w:rPr>
+            </w:pPr>
+          </w:p>
+        </w:tc>
+        <w:tc>
+          <w:tcPr>
+            <w:tcW w:w="563" w:type="dxa"/>
             <w:tcBorders>
               <w:top w:val="nil"/>
               <w:left w:val="single" w:sz="4" w:space="0" w:color="auto"/>
@@ -5247,13 +6188,34 @@
         <w:tc>
           <w:tcPr>
             <w:tcW w:w="1887" w:type="dxa"/>
-            <w:vMerge w:val="restart"/>
-            <w:tcBorders>
-              <w:top w:val="single" w:sz="12" w:space="0" w:color="auto"/>
+            <w:vMerge/>
+            <w:tcBorders>
               <w:left w:val="single" w:sz="12" w:space="0" w:color="auto"/>
+              <w:bottom w:val="single" w:sz="12" w:space="0" w:color="auto"/>
               <w:right w:val="single" w:sz="4" w:space="0" w:color="auto"/>
             </w:tcBorders>
-            <w:shd w:val="clear" w:color="auto" w:fill="FFD966" w:themeFill="accent4" w:themeFillTint="99"/>
+            <w:shd w:val="clear" w:color="auto" w:fill="F4B083" w:themeFill="accent2" w:themeFillTint="99"/>
+          </w:tcPr>
+          <w:p>
+            <w:pPr>
+              <w:rPr>
+                <w:rFonts w:ascii="Times New Roman" w:hAnsi="Times New Roman" w:cs="Times New Roman"/>
+                <w:sz w:val="24"/>
+                <w:szCs w:val="24"/>
+                <w:lang w:val="en-US"/>
+              </w:rPr>
+            </w:pPr>
+          </w:p>
+        </w:tc>
+        <w:tc>
+          <w:tcPr>
+            <w:tcW w:w="3910" w:type="dxa"/>
+            <w:tcBorders>
+              <w:left w:val="single" w:sz="4" w:space="0" w:color="auto"/>
+              <w:bottom w:val="single" w:sz="12" w:space="0" w:color="auto"/>
+              <w:right w:val="single" w:sz="12" w:space="0" w:color="auto"/>
+            </w:tcBorders>
+            <w:shd w:val="clear" w:color="auto" w:fill="FBE4D5" w:themeFill="accent2" w:themeFillTint="33"/>
           </w:tcPr>
           <w:p>
             <w:pPr>
@@ -5269,43 +6231,23 @@
                 <w:rFonts w:ascii="Times New Roman" w:hAnsi="Times New Roman" w:cs="Times New Roman"/>
                 <w:sz w:val="24"/>
                 <w:szCs w:val="24"/>
-              </w:rPr>
-              <w:t>Feature Selection and Engineering</w:t>
+                <w:lang w:val="en-US"/>
+              </w:rPr>
+              <w:t>Analyze</w:t>
             </w:r>
-          </w:p>
-        </w:tc>
-        <w:tc>
-          <w:tcPr>
-            <w:tcW w:w="2764" w:type="dxa"/>
-            <w:tcBorders>
-              <w:top w:val="single" w:sz="12" w:space="0" w:color="auto"/>
-              <w:left w:val="single" w:sz="4" w:space="0" w:color="auto"/>
-              <w:right w:val="single" w:sz="12" w:space="0" w:color="auto"/>
-            </w:tcBorders>
-            <w:shd w:val="clear" w:color="auto" w:fill="FFF2CC" w:themeFill="accent4" w:themeFillTint="33"/>
-          </w:tcPr>
-          <w:p>
-            <w:pPr>
-              <w:rPr>
-                <w:rFonts w:ascii="Times New Roman" w:hAnsi="Times New Roman" w:cs="Times New Roman"/>
-                <w:sz w:val="24"/>
-                <w:szCs w:val="24"/>
-                <w:lang w:val="en-US"/>
-              </w:rPr>
-            </w:pPr>
             <w:r>
               <w:rPr>
                 <w:rFonts w:ascii="Times New Roman" w:hAnsi="Times New Roman" w:cs="Times New Roman"/>
                 <w:sz w:val="24"/>
                 <w:szCs w:val="24"/>
               </w:rPr>
-              <w:t>Further analysis using binning and density plots</w:t>
+              <w:t xml:space="preserve"> grouped data</w:t>
             </w:r>
           </w:p>
         </w:tc>
         <w:tc>
           <w:tcPr>
-            <w:tcW w:w="672" w:type="dxa"/>
+            <w:tcW w:w="567" w:type="dxa"/>
             <w:tcBorders>
               <w:top w:val="nil"/>
               <w:left w:val="single" w:sz="12" w:space="0" w:color="auto"/>
@@ -5326,7 +6268,7 @@
         </w:tc>
         <w:tc>
           <w:tcPr>
-            <w:tcW w:w="608" w:type="dxa"/>
+            <w:tcW w:w="567" w:type="dxa"/>
             <w:tcBorders>
               <w:top w:val="nil"/>
               <w:left w:val="single" w:sz="4" w:space="0" w:color="auto"/>
@@ -5347,261 +6289,78 @@
         </w:tc>
         <w:tc>
           <w:tcPr>
-            <w:tcW w:w="717" w:type="dxa"/>
-            <w:gridSpan w:val="2"/>
+            <w:tcW w:w="567" w:type="dxa"/>
             <w:tcBorders>
               <w:top w:val="nil"/>
               <w:left w:val="single" w:sz="4" w:space="0" w:color="auto"/>
               <w:bottom w:val="nil"/>
               <w:right w:val="single" w:sz="4" w:space="0" w:color="auto"/>
             </w:tcBorders>
-            <w:shd w:val="clear" w:color="auto" w:fill="5B9BD5" w:themeFill="accent1"/>
-          </w:tcPr>
-          <w:p>
-            <w:pPr>
-              <w:rPr>
-                <w:rFonts w:ascii="Times New Roman" w:hAnsi="Times New Roman" w:cs="Times New Roman"/>
-                <w:sz w:val="24"/>
-                <w:szCs w:val="24"/>
-                <w:lang w:val="en-US"/>
-              </w:rPr>
-            </w:pPr>
-          </w:p>
-        </w:tc>
-        <w:tc>
-          <w:tcPr>
-            <w:tcW w:w="700" w:type="dxa"/>
+          </w:tcPr>
+          <w:p>
+            <w:pPr>
+              <w:rPr>
+                <w:rFonts w:ascii="Times New Roman" w:hAnsi="Times New Roman" w:cs="Times New Roman"/>
+                <w:sz w:val="24"/>
+                <w:szCs w:val="24"/>
+                <w:lang w:val="en-US"/>
+              </w:rPr>
+            </w:pPr>
+          </w:p>
+        </w:tc>
+        <w:tc>
+          <w:tcPr>
+            <w:tcW w:w="567" w:type="dxa"/>
             <w:tcBorders>
               <w:top w:val="nil"/>
               <w:left w:val="single" w:sz="4" w:space="0" w:color="auto"/>
               <w:bottom w:val="nil"/>
               <w:right w:val="single" w:sz="12" w:space="0" w:color="auto"/>
             </w:tcBorders>
-            <w:shd w:val="clear" w:color="auto" w:fill="5B9BD5" w:themeFill="accent1"/>
-          </w:tcPr>
-          <w:p>
-            <w:pPr>
-              <w:rPr>
-                <w:rFonts w:ascii="Times New Roman" w:hAnsi="Times New Roman" w:cs="Times New Roman"/>
-                <w:sz w:val="24"/>
-                <w:szCs w:val="24"/>
-                <w:lang w:val="en-US"/>
-              </w:rPr>
-            </w:pPr>
-          </w:p>
-        </w:tc>
-        <w:tc>
-          <w:tcPr>
-            <w:tcW w:w="811" w:type="dxa"/>
+            <w:shd w:val="clear" w:color="auto" w:fill="FFFFFF" w:themeFill="background1"/>
+          </w:tcPr>
+          <w:p>
+            <w:pPr>
+              <w:rPr>
+                <w:rFonts w:ascii="Times New Roman" w:hAnsi="Times New Roman" w:cs="Times New Roman"/>
+                <w:sz w:val="24"/>
+                <w:szCs w:val="24"/>
+                <w:lang w:val="en-US"/>
+              </w:rPr>
+            </w:pPr>
+          </w:p>
+        </w:tc>
+        <w:tc>
+          <w:tcPr>
+            <w:tcW w:w="567" w:type="dxa"/>
             <w:tcBorders>
               <w:top w:val="nil"/>
               <w:left w:val="single" w:sz="12" w:space="0" w:color="auto"/>
               <w:bottom w:val="nil"/>
               <w:right w:val="single" w:sz="4" w:space="0" w:color="auto"/>
             </w:tcBorders>
-            <w:shd w:val="clear" w:color="auto" w:fill="FFFFFF" w:themeFill="background1"/>
-          </w:tcPr>
-          <w:p>
-            <w:pPr>
-              <w:rPr>
-                <w:rFonts w:ascii="Times New Roman" w:hAnsi="Times New Roman" w:cs="Times New Roman"/>
-                <w:sz w:val="24"/>
-                <w:szCs w:val="24"/>
-                <w:lang w:val="en-US"/>
-              </w:rPr>
-            </w:pPr>
-          </w:p>
-        </w:tc>
-        <w:tc>
-          <w:tcPr>
-            <w:tcW w:w="890" w:type="dxa"/>
+            <w:shd w:val="clear" w:color="auto" w:fill="5B9BD5" w:themeFill="accent1"/>
+          </w:tcPr>
+          <w:p>
+            <w:pPr>
+              <w:rPr>
+                <w:rFonts w:ascii="Times New Roman" w:hAnsi="Times New Roman" w:cs="Times New Roman"/>
+                <w:sz w:val="24"/>
+                <w:szCs w:val="24"/>
+                <w:lang w:val="en-US"/>
+              </w:rPr>
+            </w:pPr>
+          </w:p>
+        </w:tc>
+        <w:tc>
+          <w:tcPr>
+            <w:tcW w:w="567" w:type="dxa"/>
             <w:tcBorders>
               <w:top w:val="nil"/>
               <w:left w:val="single" w:sz="4" w:space="0" w:color="auto"/>
               <w:bottom w:val="nil"/>
               <w:right w:val="single" w:sz="4" w:space="0" w:color="auto"/>
             </w:tcBorders>
-          </w:tcPr>
-          <w:p>
-            <w:pPr>
-              <w:rPr>
-                <w:rFonts w:ascii="Times New Roman" w:hAnsi="Times New Roman" w:cs="Times New Roman"/>
-                <w:sz w:val="24"/>
-                <w:szCs w:val="24"/>
-                <w:lang w:val="en-US"/>
-              </w:rPr>
-            </w:pPr>
-          </w:p>
-        </w:tc>
-        <w:tc>
-          <w:tcPr>
-            <w:tcW w:w="713" w:type="dxa"/>
-            <w:tcBorders>
-              <w:top w:val="nil"/>
-              <w:left w:val="single" w:sz="4" w:space="0" w:color="auto"/>
-              <w:bottom w:val="nil"/>
-              <w:right w:val="single" w:sz="4" w:space="0" w:color="auto"/>
-            </w:tcBorders>
-          </w:tcPr>
-          <w:p>
-            <w:pPr>
-              <w:rPr>
-                <w:rFonts w:ascii="Times New Roman" w:hAnsi="Times New Roman" w:cs="Times New Roman"/>
-                <w:sz w:val="24"/>
-                <w:szCs w:val="24"/>
-                <w:lang w:val="en-US"/>
-              </w:rPr>
-            </w:pPr>
-          </w:p>
-        </w:tc>
-        <w:tc>
-          <w:tcPr>
-            <w:tcW w:w="571" w:type="dxa"/>
-            <w:tcBorders>
-              <w:top w:val="nil"/>
-              <w:left w:val="single" w:sz="4" w:space="0" w:color="auto"/>
-              <w:bottom w:val="nil"/>
-              <w:right w:val="single" w:sz="12" w:space="0" w:color="auto"/>
-            </w:tcBorders>
-          </w:tcPr>
-          <w:p>
-            <w:pPr>
-              <w:rPr>
-                <w:rFonts w:ascii="Times New Roman" w:hAnsi="Times New Roman" w:cs="Times New Roman"/>
-                <w:sz w:val="24"/>
-                <w:szCs w:val="24"/>
-                <w:lang w:val="en-US"/>
-              </w:rPr>
-            </w:pPr>
-          </w:p>
-        </w:tc>
-      </w:tr>
-      <w:tr>
-        <w:trPr>
-          <w:trHeight w:val="353"/>
-        </w:trPr>
-        <w:tc>
-          <w:tcPr>
-            <w:tcW w:w="1887" w:type="dxa"/>
-            <w:vMerge/>
-            <w:tcBorders>
-              <w:left w:val="single" w:sz="12" w:space="0" w:color="auto"/>
-              <w:right w:val="single" w:sz="4" w:space="0" w:color="auto"/>
-            </w:tcBorders>
-            <w:shd w:val="clear" w:color="auto" w:fill="FFD966" w:themeFill="accent4" w:themeFillTint="99"/>
-          </w:tcPr>
-          <w:p>
-            <w:pPr>
-              <w:rPr>
-                <w:rFonts w:ascii="Times New Roman" w:hAnsi="Times New Roman" w:cs="Times New Roman"/>
-                <w:sz w:val="24"/>
-                <w:szCs w:val="24"/>
-                <w:lang w:val="en-US"/>
-              </w:rPr>
-            </w:pPr>
-          </w:p>
-        </w:tc>
-        <w:tc>
-          <w:tcPr>
-            <w:tcW w:w="2764" w:type="dxa"/>
-            <w:tcBorders>
-              <w:left w:val="single" w:sz="4" w:space="0" w:color="auto"/>
-              <w:right w:val="single" w:sz="12" w:space="0" w:color="auto"/>
-            </w:tcBorders>
-            <w:shd w:val="clear" w:color="auto" w:fill="FFF2CC" w:themeFill="accent4" w:themeFillTint="33"/>
-          </w:tcPr>
-          <w:p>
-            <w:pPr>
-              <w:rPr>
-                <w:rFonts w:ascii="Times New Roman" w:hAnsi="Times New Roman" w:cs="Times New Roman"/>
-                <w:sz w:val="24"/>
-                <w:szCs w:val="24"/>
-                <w:lang w:val="en-US"/>
-              </w:rPr>
-            </w:pPr>
-            <w:r>
-              <w:rPr>
-                <w:rFonts w:ascii="Times New Roman" w:hAnsi="Times New Roman" w:cs="Times New Roman"/>
-                <w:sz w:val="24"/>
-                <w:szCs w:val="24"/>
-              </w:rPr>
-              <w:t>Create new meaningful attributes</w:t>
-            </w:r>
-          </w:p>
-        </w:tc>
-        <w:tc>
-          <w:tcPr>
-            <w:tcW w:w="672" w:type="dxa"/>
-            <w:tcBorders>
-              <w:top w:val="nil"/>
-              <w:left w:val="single" w:sz="12" w:space="0" w:color="auto"/>
-              <w:bottom w:val="nil"/>
-              <w:right w:val="single" w:sz="4" w:space="0" w:color="auto"/>
-            </w:tcBorders>
-          </w:tcPr>
-          <w:p>
-            <w:pPr>
-              <w:rPr>
-                <w:rFonts w:ascii="Times New Roman" w:hAnsi="Times New Roman" w:cs="Times New Roman"/>
-                <w:sz w:val="24"/>
-                <w:szCs w:val="24"/>
-                <w:lang w:val="en-US"/>
-              </w:rPr>
-            </w:pPr>
-          </w:p>
-        </w:tc>
-        <w:tc>
-          <w:tcPr>
-            <w:tcW w:w="608" w:type="dxa"/>
-            <w:tcBorders>
-              <w:top w:val="nil"/>
-              <w:left w:val="single" w:sz="4" w:space="0" w:color="auto"/>
-              <w:bottom w:val="nil"/>
-              <w:right w:val="single" w:sz="4" w:space="0" w:color="auto"/>
-            </w:tcBorders>
-          </w:tcPr>
-          <w:p>
-            <w:pPr>
-              <w:rPr>
-                <w:rFonts w:ascii="Times New Roman" w:hAnsi="Times New Roman" w:cs="Times New Roman"/>
-                <w:sz w:val="24"/>
-                <w:szCs w:val="24"/>
-                <w:lang w:val="en-US"/>
-              </w:rPr>
-            </w:pPr>
-          </w:p>
-        </w:tc>
-        <w:tc>
-          <w:tcPr>
-            <w:tcW w:w="717" w:type="dxa"/>
-            <w:gridSpan w:val="2"/>
-            <w:tcBorders>
-              <w:top w:val="nil"/>
-              <w:left w:val="single" w:sz="4" w:space="0" w:color="auto"/>
-              <w:bottom w:val="nil"/>
-              <w:right w:val="single" w:sz="4" w:space="0" w:color="auto"/>
-            </w:tcBorders>
-          </w:tcPr>
-          <w:p>
-            <w:pPr>
-              <w:rPr>
-                <w:rFonts w:ascii="Times New Roman" w:hAnsi="Times New Roman" w:cs="Times New Roman"/>
-                <w:sz w:val="24"/>
-                <w:szCs w:val="24"/>
-                <w:lang w:val="en-US"/>
-              </w:rPr>
-            </w:pPr>
-          </w:p>
-        </w:tc>
-        <w:tc>
-          <w:tcPr>
-            <w:tcW w:w="700" w:type="dxa"/>
-            <w:tcBorders>
-              <w:top w:val="nil"/>
-              <w:left w:val="single" w:sz="4" w:space="0" w:color="auto"/>
-              <w:bottom w:val="nil"/>
-              <w:right w:val="single" w:sz="12" w:space="0" w:color="auto"/>
-            </w:tcBorders>
             <w:shd w:val="clear" w:color="auto" w:fill="5B9BD5" w:themeFill="accent1"/>
           </w:tcPr>
           <w:p>
@@ -5617,513 +6376,7 @@
         </w:tc>
         <w:tc>
           <w:tcPr>
-            <w:tcW w:w="811" w:type="dxa"/>
-            <w:tcBorders>
-              <w:top w:val="nil"/>
-              <w:left w:val="single" w:sz="12" w:space="0" w:color="auto"/>
-              <w:bottom w:val="nil"/>
-              <w:right w:val="single" w:sz="4" w:space="0" w:color="auto"/>
-            </w:tcBorders>
-            <w:shd w:val="clear" w:color="auto" w:fill="5B9BD5" w:themeFill="accent1"/>
-          </w:tcPr>
-          <w:p>
-            <w:pPr>
-              <w:rPr>
-                <w:rFonts w:ascii="Times New Roman" w:hAnsi="Times New Roman" w:cs="Times New Roman"/>
-                <w:sz w:val="24"/>
-                <w:szCs w:val="24"/>
-                <w:lang w:val="en-US"/>
-              </w:rPr>
-            </w:pPr>
-          </w:p>
-        </w:tc>
-        <w:tc>
-          <w:tcPr>
-            <w:tcW w:w="890" w:type="dxa"/>
-            <w:tcBorders>
-              <w:top w:val="nil"/>
-              <w:left w:val="single" w:sz="4" w:space="0" w:color="auto"/>
-              <w:bottom w:val="nil"/>
-              <w:right w:val="single" w:sz="4" w:space="0" w:color="auto"/>
-            </w:tcBorders>
-            <w:shd w:val="clear" w:color="auto" w:fill="FFFFFF" w:themeFill="background1"/>
-          </w:tcPr>
-          <w:p>
-            <w:pPr>
-              <w:rPr>
-                <w:rFonts w:ascii="Times New Roman" w:hAnsi="Times New Roman" w:cs="Times New Roman"/>
-                <w:sz w:val="24"/>
-                <w:szCs w:val="24"/>
-                <w:lang w:val="en-US"/>
-              </w:rPr>
-            </w:pPr>
-          </w:p>
-        </w:tc>
-        <w:tc>
-          <w:tcPr>
-            <w:tcW w:w="713" w:type="dxa"/>
-            <w:tcBorders>
-              <w:top w:val="nil"/>
-              <w:left w:val="single" w:sz="4" w:space="0" w:color="auto"/>
-              <w:bottom w:val="nil"/>
-              <w:right w:val="single" w:sz="4" w:space="0" w:color="auto"/>
-            </w:tcBorders>
-          </w:tcPr>
-          <w:p>
-            <w:pPr>
-              <w:rPr>
-                <w:rFonts w:ascii="Times New Roman" w:hAnsi="Times New Roman" w:cs="Times New Roman"/>
-                <w:sz w:val="24"/>
-                <w:szCs w:val="24"/>
-                <w:lang w:val="en-US"/>
-              </w:rPr>
-            </w:pPr>
-          </w:p>
-        </w:tc>
-        <w:tc>
-          <w:tcPr>
-            <w:tcW w:w="571" w:type="dxa"/>
-            <w:tcBorders>
-              <w:top w:val="nil"/>
-              <w:left w:val="single" w:sz="4" w:space="0" w:color="auto"/>
-              <w:bottom w:val="nil"/>
-              <w:right w:val="single" w:sz="12" w:space="0" w:color="auto"/>
-            </w:tcBorders>
-          </w:tcPr>
-          <w:p>
-            <w:pPr>
-              <w:rPr>
-                <w:rFonts w:ascii="Times New Roman" w:hAnsi="Times New Roman" w:cs="Times New Roman"/>
-                <w:sz w:val="24"/>
-                <w:szCs w:val="24"/>
-                <w:lang w:val="en-US"/>
-              </w:rPr>
-            </w:pPr>
-          </w:p>
-        </w:tc>
-      </w:tr>
-      <w:tr>
-        <w:trPr>
-          <w:trHeight w:val="353"/>
-        </w:trPr>
-        <w:tc>
-          <w:tcPr>
-            <w:tcW w:w="1887" w:type="dxa"/>
-            <w:vMerge/>
-            <w:tcBorders>
-              <w:left w:val="single" w:sz="12" w:space="0" w:color="auto"/>
-              <w:bottom w:val="single" w:sz="12" w:space="0" w:color="auto"/>
-              <w:right w:val="single" w:sz="4" w:space="0" w:color="auto"/>
-            </w:tcBorders>
-            <w:shd w:val="clear" w:color="auto" w:fill="FFD966" w:themeFill="accent4" w:themeFillTint="99"/>
-          </w:tcPr>
-          <w:p>
-            <w:pPr>
-              <w:rPr>
-                <w:rFonts w:ascii="Times New Roman" w:hAnsi="Times New Roman" w:cs="Times New Roman"/>
-                <w:sz w:val="24"/>
-                <w:szCs w:val="24"/>
-                <w:lang w:val="en-US"/>
-              </w:rPr>
-            </w:pPr>
-          </w:p>
-        </w:tc>
-        <w:tc>
-          <w:tcPr>
-            <w:tcW w:w="2764" w:type="dxa"/>
-            <w:tcBorders>
-              <w:left w:val="single" w:sz="4" w:space="0" w:color="auto"/>
-              <w:bottom w:val="single" w:sz="12" w:space="0" w:color="auto"/>
-              <w:right w:val="single" w:sz="12" w:space="0" w:color="auto"/>
-            </w:tcBorders>
-            <w:shd w:val="clear" w:color="auto" w:fill="FFF2CC" w:themeFill="accent4" w:themeFillTint="33"/>
-          </w:tcPr>
-          <w:p>
-            <w:pPr>
-              <w:rPr>
-                <w:rFonts w:ascii="Times New Roman" w:hAnsi="Times New Roman" w:cs="Times New Roman"/>
-                <w:sz w:val="24"/>
-                <w:szCs w:val="24"/>
-                <w:lang w:val="en-US"/>
-              </w:rPr>
-            </w:pPr>
-            <w:r>
-              <w:rPr>
-                <w:rFonts w:ascii="Times New Roman" w:hAnsi="Times New Roman" w:cs="Times New Roman"/>
-                <w:sz w:val="24"/>
-                <w:szCs w:val="24"/>
-              </w:rPr>
-              <w:t>Fit a classification model</w:t>
-            </w:r>
-          </w:p>
-        </w:tc>
-        <w:tc>
-          <w:tcPr>
-            <w:tcW w:w="672" w:type="dxa"/>
-            <w:tcBorders>
-              <w:top w:val="nil"/>
-              <w:left w:val="single" w:sz="12" w:space="0" w:color="auto"/>
-              <w:bottom w:val="nil"/>
-              <w:right w:val="single" w:sz="4" w:space="0" w:color="auto"/>
-            </w:tcBorders>
-          </w:tcPr>
-          <w:p>
-            <w:pPr>
-              <w:rPr>
-                <w:rFonts w:ascii="Times New Roman" w:hAnsi="Times New Roman" w:cs="Times New Roman"/>
-                <w:sz w:val="24"/>
-                <w:szCs w:val="24"/>
-                <w:lang w:val="en-US"/>
-              </w:rPr>
-            </w:pPr>
-          </w:p>
-        </w:tc>
-        <w:tc>
-          <w:tcPr>
-            <w:tcW w:w="608" w:type="dxa"/>
-            <w:tcBorders>
-              <w:top w:val="nil"/>
-              <w:left w:val="single" w:sz="4" w:space="0" w:color="auto"/>
-              <w:bottom w:val="nil"/>
-              <w:right w:val="single" w:sz="4" w:space="0" w:color="auto"/>
-            </w:tcBorders>
-          </w:tcPr>
-          <w:p>
-            <w:pPr>
-              <w:rPr>
-                <w:rFonts w:ascii="Times New Roman" w:hAnsi="Times New Roman" w:cs="Times New Roman"/>
-                <w:sz w:val="24"/>
-                <w:szCs w:val="24"/>
-                <w:lang w:val="en-US"/>
-              </w:rPr>
-            </w:pPr>
-          </w:p>
-        </w:tc>
-        <w:tc>
-          <w:tcPr>
-            <w:tcW w:w="717" w:type="dxa"/>
-            <w:gridSpan w:val="2"/>
-            <w:tcBorders>
-              <w:top w:val="nil"/>
-              <w:left w:val="single" w:sz="4" w:space="0" w:color="auto"/>
-              <w:bottom w:val="nil"/>
-              <w:right w:val="single" w:sz="4" w:space="0" w:color="auto"/>
-            </w:tcBorders>
-          </w:tcPr>
-          <w:p>
-            <w:pPr>
-              <w:rPr>
-                <w:rFonts w:ascii="Times New Roman" w:hAnsi="Times New Roman" w:cs="Times New Roman"/>
-                <w:sz w:val="24"/>
-                <w:szCs w:val="24"/>
-                <w:lang w:val="en-US"/>
-              </w:rPr>
-            </w:pPr>
-          </w:p>
-        </w:tc>
-        <w:tc>
-          <w:tcPr>
-            <w:tcW w:w="700" w:type="dxa"/>
-            <w:tcBorders>
-              <w:top w:val="nil"/>
-              <w:left w:val="single" w:sz="4" w:space="0" w:color="auto"/>
-              <w:bottom w:val="nil"/>
-              <w:right w:val="single" w:sz="12" w:space="0" w:color="auto"/>
-            </w:tcBorders>
-          </w:tcPr>
-          <w:p>
-            <w:pPr>
-              <w:rPr>
-                <w:rFonts w:ascii="Times New Roman" w:hAnsi="Times New Roman" w:cs="Times New Roman"/>
-                <w:sz w:val="24"/>
-                <w:szCs w:val="24"/>
-                <w:lang w:val="en-US"/>
-              </w:rPr>
-            </w:pPr>
-          </w:p>
-        </w:tc>
-        <w:tc>
-          <w:tcPr>
-            <w:tcW w:w="811" w:type="dxa"/>
-            <w:tcBorders>
-              <w:top w:val="nil"/>
-              <w:left w:val="single" w:sz="12" w:space="0" w:color="auto"/>
-              <w:bottom w:val="nil"/>
-              <w:right w:val="single" w:sz="4" w:space="0" w:color="auto"/>
-            </w:tcBorders>
-            <w:shd w:val="clear" w:color="auto" w:fill="5B9BD5" w:themeFill="accent1"/>
-          </w:tcPr>
-          <w:p>
-            <w:pPr>
-              <w:rPr>
-                <w:rFonts w:ascii="Times New Roman" w:hAnsi="Times New Roman" w:cs="Times New Roman"/>
-                <w:sz w:val="24"/>
-                <w:szCs w:val="24"/>
-                <w:lang w:val="en-US"/>
-              </w:rPr>
-            </w:pPr>
-          </w:p>
-        </w:tc>
-        <w:tc>
-          <w:tcPr>
-            <w:tcW w:w="890" w:type="dxa"/>
-            <w:tcBorders>
-              <w:top w:val="nil"/>
-              <w:left w:val="single" w:sz="4" w:space="0" w:color="auto"/>
-              <w:bottom w:val="nil"/>
-              <w:right w:val="single" w:sz="4" w:space="0" w:color="auto"/>
-            </w:tcBorders>
-            <w:shd w:val="clear" w:color="auto" w:fill="FFFFFF" w:themeFill="background1"/>
-          </w:tcPr>
-          <w:p>
-            <w:pPr>
-              <w:rPr>
-                <w:rFonts w:ascii="Times New Roman" w:hAnsi="Times New Roman" w:cs="Times New Roman"/>
-                <w:sz w:val="24"/>
-                <w:szCs w:val="24"/>
-                <w:lang w:val="en-US"/>
-              </w:rPr>
-            </w:pPr>
-          </w:p>
-        </w:tc>
-        <w:tc>
-          <w:tcPr>
-            <w:tcW w:w="713" w:type="dxa"/>
-            <w:tcBorders>
-              <w:top w:val="nil"/>
-              <w:left w:val="single" w:sz="4" w:space="0" w:color="auto"/>
-              <w:bottom w:val="nil"/>
-              <w:right w:val="single" w:sz="4" w:space="0" w:color="auto"/>
-            </w:tcBorders>
-          </w:tcPr>
-          <w:p>
-            <w:pPr>
-              <w:rPr>
-                <w:rFonts w:ascii="Times New Roman" w:hAnsi="Times New Roman" w:cs="Times New Roman"/>
-                <w:sz w:val="24"/>
-                <w:szCs w:val="24"/>
-                <w:lang w:val="en-US"/>
-              </w:rPr>
-            </w:pPr>
-          </w:p>
-        </w:tc>
-        <w:tc>
-          <w:tcPr>
-            <w:tcW w:w="571" w:type="dxa"/>
-            <w:tcBorders>
-              <w:top w:val="nil"/>
-              <w:left w:val="single" w:sz="4" w:space="0" w:color="auto"/>
-              <w:bottom w:val="nil"/>
-              <w:right w:val="single" w:sz="12" w:space="0" w:color="auto"/>
-            </w:tcBorders>
-          </w:tcPr>
-          <w:p>
-            <w:pPr>
-              <w:rPr>
-                <w:rFonts w:ascii="Times New Roman" w:hAnsi="Times New Roman" w:cs="Times New Roman"/>
-                <w:sz w:val="24"/>
-                <w:szCs w:val="24"/>
-                <w:lang w:val="en-US"/>
-              </w:rPr>
-            </w:pPr>
-          </w:p>
-        </w:tc>
-      </w:tr>
-      <w:tr>
-        <w:trPr>
-          <w:trHeight w:val="353"/>
-        </w:trPr>
-        <w:tc>
-          <w:tcPr>
-            <w:tcW w:w="1887" w:type="dxa"/>
-            <w:vMerge w:val="restart"/>
-            <w:tcBorders>
-              <w:top w:val="single" w:sz="12" w:space="0" w:color="auto"/>
-              <w:left w:val="single" w:sz="12" w:space="0" w:color="auto"/>
-              <w:right w:val="single" w:sz="4" w:space="0" w:color="auto"/>
-            </w:tcBorders>
-            <w:shd w:val="clear" w:color="auto" w:fill="F4B083" w:themeFill="accent2" w:themeFillTint="99"/>
-          </w:tcPr>
-          <w:p>
-            <w:pPr>
-              <w:rPr>
-                <w:rFonts w:ascii="Times New Roman" w:hAnsi="Times New Roman" w:cs="Times New Roman"/>
-                <w:sz w:val="24"/>
-                <w:szCs w:val="24"/>
-                <w:lang w:val="en-US"/>
-              </w:rPr>
-            </w:pPr>
-            <w:r>
-              <w:rPr>
-                <w:rFonts w:ascii="Times New Roman" w:hAnsi="Times New Roman" w:cs="Times New Roman"/>
-                <w:sz w:val="24"/>
-                <w:szCs w:val="24"/>
-              </w:rPr>
-              <w:t>Aggregate Past Data</w:t>
-            </w:r>
-          </w:p>
-        </w:tc>
-        <w:tc>
-          <w:tcPr>
-            <w:tcW w:w="2764" w:type="dxa"/>
-            <w:tcBorders>
-              <w:top w:val="single" w:sz="12" w:space="0" w:color="auto"/>
-              <w:left w:val="single" w:sz="4" w:space="0" w:color="auto"/>
-              <w:right w:val="single" w:sz="12" w:space="0" w:color="auto"/>
-            </w:tcBorders>
-            <w:shd w:val="clear" w:color="auto" w:fill="FBE4D5" w:themeFill="accent2" w:themeFillTint="33"/>
-          </w:tcPr>
-          <w:p>
-            <w:pPr>
-              <w:rPr>
-                <w:rFonts w:ascii="Times New Roman" w:hAnsi="Times New Roman" w:cs="Times New Roman"/>
-                <w:sz w:val="24"/>
-                <w:szCs w:val="24"/>
-                <w:lang w:val="en-US"/>
-              </w:rPr>
-            </w:pPr>
-            <w:r>
-              <w:rPr>
-                <w:rFonts w:ascii="Times New Roman" w:hAnsi="Times New Roman" w:cs="Times New Roman"/>
-                <w:sz w:val="24"/>
-                <w:szCs w:val="24"/>
-              </w:rPr>
-              <w:t>Grouping and aggregation</w:t>
-            </w:r>
-          </w:p>
-        </w:tc>
-        <w:tc>
-          <w:tcPr>
-            <w:tcW w:w="672" w:type="dxa"/>
-            <w:tcBorders>
-              <w:top w:val="nil"/>
-              <w:left w:val="single" w:sz="12" w:space="0" w:color="auto"/>
-              <w:bottom w:val="nil"/>
-              <w:right w:val="single" w:sz="4" w:space="0" w:color="auto"/>
-            </w:tcBorders>
-          </w:tcPr>
-          <w:p>
-            <w:pPr>
-              <w:rPr>
-                <w:rFonts w:ascii="Times New Roman" w:hAnsi="Times New Roman" w:cs="Times New Roman"/>
-                <w:sz w:val="24"/>
-                <w:szCs w:val="24"/>
-                <w:lang w:val="en-US"/>
-              </w:rPr>
-            </w:pPr>
-          </w:p>
-        </w:tc>
-        <w:tc>
-          <w:tcPr>
-            <w:tcW w:w="608" w:type="dxa"/>
-            <w:tcBorders>
-              <w:top w:val="nil"/>
-              <w:left w:val="single" w:sz="4" w:space="0" w:color="auto"/>
-              <w:bottom w:val="nil"/>
-              <w:right w:val="single" w:sz="4" w:space="0" w:color="auto"/>
-            </w:tcBorders>
-          </w:tcPr>
-          <w:p>
-            <w:pPr>
-              <w:rPr>
-                <w:rFonts w:ascii="Times New Roman" w:hAnsi="Times New Roman" w:cs="Times New Roman"/>
-                <w:sz w:val="24"/>
-                <w:szCs w:val="24"/>
-                <w:lang w:val="en-US"/>
-              </w:rPr>
-            </w:pPr>
-          </w:p>
-        </w:tc>
-        <w:tc>
-          <w:tcPr>
-            <w:tcW w:w="717" w:type="dxa"/>
-            <w:gridSpan w:val="2"/>
-            <w:tcBorders>
-              <w:top w:val="nil"/>
-              <w:left w:val="single" w:sz="4" w:space="0" w:color="auto"/>
-              <w:bottom w:val="nil"/>
-              <w:right w:val="single" w:sz="4" w:space="0" w:color="auto"/>
-            </w:tcBorders>
-            <w:shd w:val="clear" w:color="auto" w:fill="5B9BD5" w:themeFill="accent1"/>
-          </w:tcPr>
-          <w:p>
-            <w:pPr>
-              <w:rPr>
-                <w:rFonts w:ascii="Times New Roman" w:hAnsi="Times New Roman" w:cs="Times New Roman"/>
-                <w:sz w:val="24"/>
-                <w:szCs w:val="24"/>
-                <w:lang w:val="en-US"/>
-              </w:rPr>
-            </w:pPr>
-          </w:p>
-        </w:tc>
-        <w:tc>
-          <w:tcPr>
-            <w:tcW w:w="700" w:type="dxa"/>
-            <w:tcBorders>
-              <w:top w:val="nil"/>
-              <w:left w:val="single" w:sz="4" w:space="0" w:color="auto"/>
-              <w:bottom w:val="nil"/>
-              <w:right w:val="single" w:sz="12" w:space="0" w:color="auto"/>
-            </w:tcBorders>
-            <w:shd w:val="clear" w:color="auto" w:fill="5B9BD5" w:themeFill="accent1"/>
-          </w:tcPr>
-          <w:p>
-            <w:pPr>
-              <w:rPr>
-                <w:rFonts w:ascii="Times New Roman" w:hAnsi="Times New Roman" w:cs="Times New Roman"/>
-                <w:sz w:val="24"/>
-                <w:szCs w:val="24"/>
-                <w:lang w:val="en-US"/>
-              </w:rPr>
-            </w:pPr>
-          </w:p>
-        </w:tc>
-        <w:tc>
-          <w:tcPr>
-            <w:tcW w:w="811" w:type="dxa"/>
-            <w:tcBorders>
-              <w:top w:val="nil"/>
-              <w:left w:val="single" w:sz="12" w:space="0" w:color="auto"/>
-              <w:bottom w:val="nil"/>
-              <w:right w:val="single" w:sz="4" w:space="0" w:color="auto"/>
-            </w:tcBorders>
-          </w:tcPr>
-          <w:p>
-            <w:pPr>
-              <w:rPr>
-                <w:rFonts w:ascii="Times New Roman" w:hAnsi="Times New Roman" w:cs="Times New Roman"/>
-                <w:sz w:val="24"/>
-                <w:szCs w:val="24"/>
-                <w:lang w:val="en-US"/>
-              </w:rPr>
-            </w:pPr>
-          </w:p>
-        </w:tc>
-        <w:tc>
-          <w:tcPr>
-            <w:tcW w:w="890" w:type="dxa"/>
-            <w:tcBorders>
-              <w:top w:val="nil"/>
-              <w:left w:val="single" w:sz="4" w:space="0" w:color="auto"/>
-              <w:bottom w:val="nil"/>
-              <w:right w:val="single" w:sz="4" w:space="0" w:color="auto"/>
-            </w:tcBorders>
-          </w:tcPr>
-          <w:p>
-            <w:pPr>
-              <w:rPr>
-                <w:rFonts w:ascii="Times New Roman" w:hAnsi="Times New Roman" w:cs="Times New Roman"/>
-                <w:sz w:val="24"/>
-                <w:szCs w:val="24"/>
-                <w:lang w:val="en-US"/>
-              </w:rPr>
-            </w:pPr>
-          </w:p>
-        </w:tc>
-        <w:tc>
-          <w:tcPr>
-            <w:tcW w:w="713" w:type="dxa"/>
+            <w:tcW w:w="563" w:type="dxa"/>
             <w:tcBorders>
               <w:top w:val="nil"/>
               <w:left w:val="single" w:sz="4" w:space="0" w:color="auto"/>
@@ -6171,243 +6424,6 @@
         <w:tc>
           <w:tcPr>
             <w:tcW w:w="1887" w:type="dxa"/>
-            <w:vMerge/>
-            <w:tcBorders>
-              <w:left w:val="single" w:sz="12" w:space="0" w:color="auto"/>
-              <w:bottom w:val="single" w:sz="12" w:space="0" w:color="auto"/>
-              <w:right w:val="single" w:sz="4" w:space="0" w:color="auto"/>
-            </w:tcBorders>
-            <w:shd w:val="clear" w:color="auto" w:fill="F4B083" w:themeFill="accent2" w:themeFillTint="99"/>
-          </w:tcPr>
-          <w:p>
-            <w:pPr>
-              <w:rPr>
-                <w:rFonts w:ascii="Times New Roman" w:hAnsi="Times New Roman" w:cs="Times New Roman"/>
-                <w:sz w:val="24"/>
-                <w:szCs w:val="24"/>
-                <w:lang w:val="en-US"/>
-              </w:rPr>
-            </w:pPr>
-          </w:p>
-        </w:tc>
-        <w:tc>
-          <w:tcPr>
-            <w:tcW w:w="2764" w:type="dxa"/>
-            <w:tcBorders>
-              <w:left w:val="single" w:sz="4" w:space="0" w:color="auto"/>
-              <w:bottom w:val="single" w:sz="12" w:space="0" w:color="auto"/>
-              <w:right w:val="single" w:sz="12" w:space="0" w:color="auto"/>
-            </w:tcBorders>
-            <w:shd w:val="clear" w:color="auto" w:fill="FBE4D5" w:themeFill="accent2" w:themeFillTint="33"/>
-          </w:tcPr>
-          <w:p>
-            <w:pPr>
-              <w:rPr>
-                <w:rFonts w:ascii="Times New Roman" w:hAnsi="Times New Roman" w:cs="Times New Roman"/>
-                <w:sz w:val="24"/>
-                <w:szCs w:val="24"/>
-                <w:lang w:val="en-US"/>
-              </w:rPr>
-            </w:pPr>
-            <w:r>
-              <w:rPr>
-                <w:rFonts w:ascii="Times New Roman" w:hAnsi="Times New Roman" w:cs="Times New Roman"/>
-                <w:sz w:val="24"/>
-                <w:szCs w:val="24"/>
-                <w:lang w:val="en-US"/>
-              </w:rPr>
-              <w:t>Analyze</w:t>
-            </w:r>
-            <w:r>
-              <w:rPr>
-                <w:rFonts w:ascii="Times New Roman" w:hAnsi="Times New Roman" w:cs="Times New Roman"/>
-                <w:sz w:val="24"/>
-                <w:szCs w:val="24"/>
-              </w:rPr>
-              <w:t xml:space="preserve"> grouped data</w:t>
-            </w:r>
-          </w:p>
-        </w:tc>
-        <w:tc>
-          <w:tcPr>
-            <w:tcW w:w="672" w:type="dxa"/>
-            <w:tcBorders>
-              <w:top w:val="nil"/>
-              <w:left w:val="single" w:sz="12" w:space="0" w:color="auto"/>
-              <w:bottom w:val="nil"/>
-              <w:right w:val="single" w:sz="4" w:space="0" w:color="auto"/>
-            </w:tcBorders>
-          </w:tcPr>
-          <w:p>
-            <w:pPr>
-              <w:rPr>
-                <w:rFonts w:ascii="Times New Roman" w:hAnsi="Times New Roman" w:cs="Times New Roman"/>
-                <w:sz w:val="24"/>
-                <w:szCs w:val="24"/>
-                <w:lang w:val="en-US"/>
-              </w:rPr>
-            </w:pPr>
-          </w:p>
-        </w:tc>
-        <w:tc>
-          <w:tcPr>
-            <w:tcW w:w="608" w:type="dxa"/>
-            <w:tcBorders>
-              <w:top w:val="nil"/>
-              <w:left w:val="single" w:sz="4" w:space="0" w:color="auto"/>
-              <w:bottom w:val="nil"/>
-              <w:right w:val="single" w:sz="4" w:space="0" w:color="auto"/>
-            </w:tcBorders>
-          </w:tcPr>
-          <w:p>
-            <w:pPr>
-              <w:rPr>
-                <w:rFonts w:ascii="Times New Roman" w:hAnsi="Times New Roman" w:cs="Times New Roman"/>
-                <w:sz w:val="24"/>
-                <w:szCs w:val="24"/>
-                <w:lang w:val="en-US"/>
-              </w:rPr>
-            </w:pPr>
-          </w:p>
-        </w:tc>
-        <w:tc>
-          <w:tcPr>
-            <w:tcW w:w="717" w:type="dxa"/>
-            <w:gridSpan w:val="2"/>
-            <w:tcBorders>
-              <w:top w:val="nil"/>
-              <w:left w:val="single" w:sz="4" w:space="0" w:color="auto"/>
-              <w:bottom w:val="nil"/>
-              <w:right w:val="single" w:sz="4" w:space="0" w:color="auto"/>
-            </w:tcBorders>
-          </w:tcPr>
-          <w:p>
-            <w:pPr>
-              <w:rPr>
-                <w:rFonts w:ascii="Times New Roman" w:hAnsi="Times New Roman" w:cs="Times New Roman"/>
-                <w:sz w:val="24"/>
-                <w:szCs w:val="24"/>
-                <w:lang w:val="en-US"/>
-              </w:rPr>
-            </w:pPr>
-          </w:p>
-        </w:tc>
-        <w:tc>
-          <w:tcPr>
-            <w:tcW w:w="700" w:type="dxa"/>
-            <w:tcBorders>
-              <w:top w:val="nil"/>
-              <w:left w:val="single" w:sz="4" w:space="0" w:color="auto"/>
-              <w:bottom w:val="nil"/>
-              <w:right w:val="single" w:sz="12" w:space="0" w:color="auto"/>
-            </w:tcBorders>
-            <w:shd w:val="clear" w:color="auto" w:fill="FFFFFF" w:themeFill="background1"/>
-          </w:tcPr>
-          <w:p>
-            <w:pPr>
-              <w:rPr>
-                <w:rFonts w:ascii="Times New Roman" w:hAnsi="Times New Roman" w:cs="Times New Roman"/>
-                <w:sz w:val="24"/>
-                <w:szCs w:val="24"/>
-                <w:lang w:val="en-US"/>
-              </w:rPr>
-            </w:pPr>
-          </w:p>
-        </w:tc>
-        <w:tc>
-          <w:tcPr>
-            <w:tcW w:w="811" w:type="dxa"/>
-            <w:tcBorders>
-              <w:top w:val="nil"/>
-              <w:left w:val="single" w:sz="12" w:space="0" w:color="auto"/>
-              <w:bottom w:val="nil"/>
-              <w:right w:val="single" w:sz="4" w:space="0" w:color="auto"/>
-            </w:tcBorders>
-            <w:shd w:val="clear" w:color="auto" w:fill="5B9BD5" w:themeFill="accent1"/>
-          </w:tcPr>
-          <w:p>
-            <w:pPr>
-              <w:rPr>
-                <w:rFonts w:ascii="Times New Roman" w:hAnsi="Times New Roman" w:cs="Times New Roman"/>
-                <w:sz w:val="24"/>
-                <w:szCs w:val="24"/>
-                <w:lang w:val="en-US"/>
-              </w:rPr>
-            </w:pPr>
-          </w:p>
-        </w:tc>
-        <w:tc>
-          <w:tcPr>
-            <w:tcW w:w="890" w:type="dxa"/>
-            <w:tcBorders>
-              <w:top w:val="nil"/>
-              <w:left w:val="single" w:sz="4" w:space="0" w:color="auto"/>
-              <w:bottom w:val="nil"/>
-              <w:right w:val="single" w:sz="4" w:space="0" w:color="auto"/>
-            </w:tcBorders>
-            <w:shd w:val="clear" w:color="auto" w:fill="5B9BD5" w:themeFill="accent1"/>
-          </w:tcPr>
-          <w:p>
-            <w:pPr>
-              <w:rPr>
-                <w:rFonts w:ascii="Times New Roman" w:hAnsi="Times New Roman" w:cs="Times New Roman"/>
-                <w:sz w:val="24"/>
-                <w:szCs w:val="24"/>
-                <w:lang w:val="en-US"/>
-              </w:rPr>
-            </w:pPr>
-          </w:p>
-        </w:tc>
-        <w:tc>
-          <w:tcPr>
-            <w:tcW w:w="713" w:type="dxa"/>
-            <w:tcBorders>
-              <w:top w:val="nil"/>
-              <w:left w:val="single" w:sz="4" w:space="0" w:color="auto"/>
-              <w:bottom w:val="nil"/>
-              <w:right w:val="single" w:sz="4" w:space="0" w:color="auto"/>
-            </w:tcBorders>
-          </w:tcPr>
-          <w:p>
-            <w:pPr>
-              <w:rPr>
-                <w:rFonts w:ascii="Times New Roman" w:hAnsi="Times New Roman" w:cs="Times New Roman"/>
-                <w:sz w:val="24"/>
-                <w:szCs w:val="24"/>
-                <w:lang w:val="en-US"/>
-              </w:rPr>
-            </w:pPr>
-          </w:p>
-        </w:tc>
-        <w:tc>
-          <w:tcPr>
-            <w:tcW w:w="571" w:type="dxa"/>
-            <w:tcBorders>
-              <w:top w:val="nil"/>
-              <w:left w:val="single" w:sz="4" w:space="0" w:color="auto"/>
-              <w:bottom w:val="nil"/>
-              <w:right w:val="single" w:sz="12" w:space="0" w:color="auto"/>
-            </w:tcBorders>
-          </w:tcPr>
-          <w:p>
-            <w:pPr>
-              <w:rPr>
-                <w:rFonts w:ascii="Times New Roman" w:hAnsi="Times New Roman" w:cs="Times New Roman"/>
-                <w:sz w:val="24"/>
-                <w:szCs w:val="24"/>
-                <w:lang w:val="en-US"/>
-              </w:rPr>
-            </w:pPr>
-          </w:p>
-        </w:tc>
-      </w:tr>
-      <w:tr>
-        <w:trPr>
-          <w:trHeight w:val="340"/>
-        </w:trPr>
-        <w:tc>
-          <w:tcPr>
-            <w:tcW w:w="1887" w:type="dxa"/>
             <w:tcBorders>
               <w:top w:val="single" w:sz="12" w:space="0" w:color="auto"/>
               <w:left w:val="single" w:sz="12" w:space="0" w:color="auto"/>
@@ -6438,7 +6454,7 @@
         </w:tc>
         <w:tc>
           <w:tcPr>
-            <w:tcW w:w="2764" w:type="dxa"/>
+            <w:tcW w:w="3910" w:type="dxa"/>
             <w:tcBorders>
               <w:top w:val="single" w:sz="12" w:space="0" w:color="auto"/>
               <w:left w:val="single" w:sz="4" w:space="0" w:color="auto"/>
@@ -6463,13 +6479,22 @@
                 <w:szCs w:val="24"/>
                 <w:lang w:val="en-US"/>
               </w:rPr>
-              <w:t>Writing and presentation</w:t>
+              <w:t>Report w</w:t>
             </w:r>
-          </w:p>
-        </w:tc>
-        <w:tc>
-          <w:tcPr>
-            <w:tcW w:w="672" w:type="dxa"/>
+            <w:r>
+              <w:rPr>
+                <w:rFonts w:ascii="Times New Roman" w:hAnsi="Times New Roman" w:cs="Times New Roman"/>
+                <w:sz w:val="24"/>
+                <w:szCs w:val="24"/>
+                <w:lang w:val="en-US"/>
+              </w:rPr>
+              <w:t>riting and presentation</w:t>
+            </w:r>
+          </w:p>
+        </w:tc>
+        <w:tc>
+          <w:tcPr>
+            <w:tcW w:w="567" w:type="dxa"/>
             <w:tcBorders>
               <w:top w:val="nil"/>
               <w:left w:val="single" w:sz="12" w:space="0" w:color="auto"/>
@@ -6490,7 +6515,7 @@
         </w:tc>
         <w:tc>
           <w:tcPr>
-            <w:tcW w:w="608" w:type="dxa"/>
+            <w:tcW w:w="567" w:type="dxa"/>
             <w:tcBorders>
               <w:top w:val="nil"/>
               <w:left w:val="single" w:sz="4" w:space="0" w:color="auto"/>
@@ -6511,8 +6536,7 @@
         </w:tc>
         <w:tc>
           <w:tcPr>
-            <w:tcW w:w="717" w:type="dxa"/>
-            <w:gridSpan w:val="2"/>
+            <w:tcW w:w="567" w:type="dxa"/>
             <w:tcBorders>
               <w:top w:val="nil"/>
               <w:left w:val="single" w:sz="4" w:space="0" w:color="auto"/>
@@ -6533,7 +6557,7 @@
         </w:tc>
         <w:tc>
           <w:tcPr>
-            <w:tcW w:w="700" w:type="dxa"/>
+            <w:tcW w:w="567" w:type="dxa"/>
             <w:tcBorders>
               <w:top w:val="nil"/>
               <w:left w:val="single" w:sz="4" w:space="0" w:color="auto"/>
@@ -6555,7 +6579,7 @@
         </w:tc>
         <w:tc>
           <w:tcPr>
-            <w:tcW w:w="811" w:type="dxa"/>
+            <w:tcW w:w="567" w:type="dxa"/>
             <w:tcBorders>
               <w:top w:val="nil"/>
               <w:left w:val="single" w:sz="12" w:space="0" w:color="auto"/>
@@ -6577,7 +6601,7 @@
         </w:tc>
         <w:tc>
           <w:tcPr>
-            <w:tcW w:w="890" w:type="dxa"/>
+            <w:tcW w:w="567" w:type="dxa"/>
             <w:tcBorders>
               <w:top w:val="nil"/>
               <w:left w:val="single" w:sz="4" w:space="0" w:color="auto"/>
@@ -6598,7 +6622,7 @@
         </w:tc>
         <w:tc>
           <w:tcPr>
-            <w:tcW w:w="713" w:type="dxa"/>
+            <w:tcW w:w="563" w:type="dxa"/>
             <w:tcBorders>
               <w:top w:val="nil"/>
               <w:left w:val="single" w:sz="4" w:space="0" w:color="auto"/>
@@ -6764,7 +6788,16 @@
           <w:szCs w:val="34"/>
           <w:lang w:val="en-US"/>
         </w:rPr>
-        <w:t xml:space="preserve">making sure that </w:t>
+        <w:t>makes</w:t>
+      </w:r>
+      <w:r>
+        <w:rPr>
+          <w:rFonts w:ascii="Times New Roman" w:hAnsi="Times New Roman" w:cs="Times New Roman"/>
+          <w:sz w:val="24"/>
+          <w:szCs w:val="34"/>
+          <w:lang w:val="en-US"/>
+        </w:rPr>
+        <w:t xml:space="preserve"> sure that </w:t>
       </w:r>
       <w:r>
         <w:rPr>
@@ -6839,66 +6872,65 @@
         </w:rPr>
         <w:t>.</w:t>
       </w:r>
+    </w:p>
+    <w:p>
+      <w:pPr>
+        <w:spacing w:line="360" w:lineRule="auto"/>
+        <w:jc w:val="both"/>
+        <w:rPr>
+          <w:rFonts w:ascii="Times New Roman" w:hAnsi="Times New Roman" w:cs="Times New Roman"/>
+          <w:sz w:val="24"/>
+          <w:szCs w:val="34"/>
+          <w:lang w:val="en-US"/>
+        </w:rPr>
+      </w:pPr>
+      <w:r>
+        <w:rPr>
+          <w:rFonts w:ascii="Times New Roman" w:hAnsi="Times New Roman" w:cs="Times New Roman"/>
+          <w:sz w:val="24"/>
+          <w:szCs w:val="34"/>
+          <w:lang w:val="en-US"/>
+        </w:rPr>
+        <w:t xml:space="preserve">Both these outcomes may help the company to not only </w:t>
+      </w:r>
+      <w:r>
+        <w:rPr>
+          <w:rFonts w:ascii="Times New Roman" w:hAnsi="Times New Roman" w:cs="Times New Roman"/>
+          <w:sz w:val="24"/>
+          <w:szCs w:val="34"/>
+          <w:lang w:val="en-US"/>
+        </w:rPr>
+        <w:t>reduce</w:t>
+      </w:r>
+      <w:r>
+        <w:rPr>
+          <w:rFonts w:ascii="Times New Roman" w:hAnsi="Times New Roman" w:cs="Times New Roman"/>
+          <w:sz w:val="24"/>
+          <w:szCs w:val="34"/>
+          <w:lang w:val="en-US"/>
+        </w:rPr>
+        <w:t xml:space="preserve"> </w:t>
+      </w:r>
+      <w:r>
+        <w:rPr>
+          <w:rFonts w:ascii="Times New Roman" w:hAnsi="Times New Roman" w:cs="Times New Roman"/>
+          <w:sz w:val="24"/>
+          <w:szCs w:val="34"/>
+          <w:lang w:val="en-US"/>
+        </w:rPr>
+        <w:t xml:space="preserve">its </w:t>
+      </w:r>
+      <w:r>
+        <w:rPr>
+          <w:rFonts w:ascii="Times New Roman" w:hAnsi="Times New Roman" w:cs="Times New Roman"/>
+          <w:sz w:val="24"/>
+          <w:szCs w:val="34"/>
+          <w:lang w:val="en-US"/>
+        </w:rPr>
+        <w:t>losses but also to achieve its main objective of credit inclusion.</w:t>
+      </w:r>
       <w:bookmarkStart w:id="0" w:name="_GoBack"/>
       <w:bookmarkEnd w:id="0"/>
-    </w:p>
-    <w:p>
-      <w:pPr>
-        <w:spacing w:line="360" w:lineRule="auto"/>
-        <w:ind w:left="357"/>
-        <w:jc w:val="both"/>
-        <w:rPr>
-          <w:rFonts w:ascii="Times New Roman" w:hAnsi="Times New Roman" w:cs="Times New Roman"/>
-          <w:sz w:val="24"/>
-          <w:szCs w:val="34"/>
-          <w:lang w:val="en-US"/>
-        </w:rPr>
-      </w:pPr>
-      <w:r>
-        <w:rPr>
-          <w:rFonts w:ascii="Times New Roman" w:hAnsi="Times New Roman" w:cs="Times New Roman"/>
-          <w:sz w:val="24"/>
-          <w:szCs w:val="34"/>
-          <w:lang w:val="en-US"/>
-        </w:rPr>
-        <w:t xml:space="preserve">Both these outcomes may help the company to not only </w:t>
-      </w:r>
-      <w:r>
-        <w:rPr>
-          <w:rFonts w:ascii="Times New Roman" w:hAnsi="Times New Roman" w:cs="Times New Roman"/>
-          <w:sz w:val="24"/>
-          <w:szCs w:val="34"/>
-          <w:lang w:val="en-US"/>
-        </w:rPr>
-        <w:t>reduce</w:t>
-      </w:r>
-      <w:r>
-        <w:rPr>
-          <w:rFonts w:ascii="Times New Roman" w:hAnsi="Times New Roman" w:cs="Times New Roman"/>
-          <w:sz w:val="24"/>
-          <w:szCs w:val="34"/>
-          <w:lang w:val="en-US"/>
-        </w:rPr>
-        <w:t xml:space="preserve"> </w:t>
-      </w:r>
-      <w:r>
-        <w:rPr>
-          <w:rFonts w:ascii="Times New Roman" w:hAnsi="Times New Roman" w:cs="Times New Roman"/>
-          <w:sz w:val="24"/>
-          <w:szCs w:val="34"/>
-          <w:lang w:val="en-US"/>
-        </w:rPr>
-        <w:t xml:space="preserve">its </w:t>
-      </w:r>
-      <w:r>
-        <w:rPr>
-          <w:rFonts w:ascii="Times New Roman" w:hAnsi="Times New Roman" w:cs="Times New Roman"/>
-          <w:sz w:val="24"/>
-          <w:szCs w:val="34"/>
-          <w:lang w:val="en-US"/>
-        </w:rPr>
-        <w:t>losses but also to achieve its main objective of credit inclusion.</w:t>
-      </w:r>
     </w:p>
     <w:sectPr>
       <w:footerReference w:type="default" r:id="rId10"/>
@@ -6970,7 +7002,7 @@
           <w:rPr>
             <w:noProof/>
           </w:rPr>
-          <w:t>6</w:t>
+          <w:t>7</w:t>
         </w:r>
         <w:r>
           <w:rPr>
@@ -8179,6 +8211,7 @@
   <w:style w:type="character" w:default="1" w:styleId="DefaultParagraphFont">
     <w:name w:val="Default Paragraph Font"/>
     <w:uiPriority w:val="1"/>
+    <w:semiHidden/>
     <w:unhideWhenUsed/>
   </w:style>
   <w:style w:type="table" w:default="1" w:styleId="TableNormal">

</xml_diff>